<commit_message>
feat(research): implement full 35-page DSR paper, poster docx, and math equation formatting
</commit_message>
<xml_diff>
--- a/research/PRD.docx
+++ b/research/PRD.docx
@@ -4,7 +4,7 @@
   <w:body>
     <w:p>
       <w:pPr>
-        <w:spacing w:before="240" w:after="80"/>
+        <w:spacing w:before="280" w:after="120"/>
         <w:jc w:val="center"/>
       </w:pPr>
       <w:r>
@@ -19,7 +19,7 @@
     </w:p>
     <w:p>
       <w:pPr>
-        <w:spacing w:after="280"/>
+        <w:spacing w:after="240"/>
         <w:jc w:val="center"/>
       </w:pPr>
       <w:r>
@@ -50,7 +50,7 @@
     </w:p>
     <w:p>
       <w:pPr>
-        <w:spacing w:after="320"/>
+        <w:spacing w:after="280"/>
         <w:jc w:val="center"/>
       </w:pPr>
       <w:r>
@@ -67,6 +67,7 @@
       <w:tblPr>
         <w:tblW w:type="auto" w:w="0"/>
         <w:jc w:val="center"/>
+        <w:tblLayout w:type="fixed"/>
         <w:tblLook w:firstColumn="1" w:firstRow="1" w:lastColumn="0" w:lastRow="0" w:noHBand="0" w:noVBand="1" w:val="04A0"/>
         <w:tblBorders>
           <w:top w:val="single" w:sz="8" w:space="0" w:color="00529B"/>
@@ -126,7 +127,7 @@
     <w:p>
       <w:pPr>
         <w:keepNext/>
-        <w:spacing w:before="320" w:after="120"/>
+        <w:spacing w:before="360" w:after="120"/>
       </w:pPr>
       <w:r>
         <w:rPr>
@@ -171,15 +172,20 @@
         <w:gridCol w:w="4680"/>
       </w:tblGrid>
       <w:tr>
+        <w:trPr>
+          <w:cantSplit/>
+          <w:tblHeader/>
+        </w:trPr>
         <w:tc>
           <w:tcPr>
             <w:tcW w:type="dxa" w:w="3600"/>
+            <w:tcW w:w="3600" w:type="dxa"/>
             <w:shd w:fill="00529B"/>
             <w:tcMar>
-              <w:top w:w="120" w:type="dxa"/>
-              <w:bottom w:w="120" w:type="dxa"/>
-              <w:left w:w="140" w:type="dxa"/>
-              <w:right w:w="140" w:type="dxa"/>
+              <w:top w:w="100" w:type="dxa"/>
+              <w:bottom w:w="100" w:type="dxa"/>
+              <w:left w:w="100" w:type="dxa"/>
+              <w:right w:w="100" w:type="dxa"/>
             </w:tcMar>
           </w:tcPr>
           <w:p>
@@ -191,7 +197,7 @@
                 <w:rFonts w:ascii="Arial" w:hAnsi="Arial"/>
                 <w:b/>
                 <w:color w:val="FFFFFF"/>
-                <w:sz w:val="20"/>
+                <w:sz w:val="19"/>
               </w:rPr>
               <w:t>Document Attribute</w:t>
             </w:r>
@@ -200,12 +206,13 @@
         <w:tc>
           <w:tcPr>
             <w:tcW w:type="dxa" w:w="5760"/>
+            <w:tcW w:w="5760" w:type="dxa"/>
             <w:shd w:fill="00529B"/>
             <w:tcMar>
-              <w:top w:w="120" w:type="dxa"/>
-              <w:bottom w:w="120" w:type="dxa"/>
-              <w:left w:w="140" w:type="dxa"/>
-              <w:right w:w="140" w:type="dxa"/>
+              <w:top w:w="100" w:type="dxa"/>
+              <w:bottom w:w="100" w:type="dxa"/>
+              <w:left w:w="100" w:type="dxa"/>
+              <w:right w:w="100" w:type="dxa"/>
             </w:tcMar>
           </w:tcPr>
           <w:p>
@@ -217,7 +224,7 @@
                 <w:rFonts w:ascii="Arial" w:hAnsi="Arial"/>
                 <w:b/>
                 <w:color w:val="FFFFFF"/>
-                <w:sz w:val="20"/>
+                <w:sz w:val="19"/>
               </w:rPr>
               <w:t>Specification Details</w:t>
             </w:r>
@@ -225,15 +232,19 @@
         </w:tc>
       </w:tr>
       <w:tr>
+        <w:trPr>
+          <w:cantSplit/>
+        </w:trPr>
         <w:tc>
           <w:tcPr>
             <w:tcW w:type="dxa" w:w="3600"/>
+            <w:tcW w:w="3600" w:type="dxa"/>
             <w:shd w:fill="FFFFFF"/>
             <w:tcMar>
-              <w:top w:w="80" w:type="dxa"/>
-              <w:bottom w:w="80" w:type="dxa"/>
-              <w:left w:w="120" w:type="dxa"/>
-              <w:right w:w="120" w:type="dxa"/>
+              <w:top w:w="60" w:type="dxa"/>
+              <w:bottom w:w="60" w:type="dxa"/>
+              <w:left w:w="80" w:type="dxa"/>
+              <w:right w:w="80" w:type="dxa"/>
             </w:tcMar>
           </w:tcPr>
           <w:p>
@@ -243,7 +254,7 @@
             <w:r>
               <w:rPr>
                 <w:rFonts w:ascii="Times New Roman" w:hAnsi="Times New Roman"/>
-                <w:sz w:val="20"/>
+                <w:sz w:val="19"/>
               </w:rPr>
               <w:t>Product Name</w:t>
             </w:r>
@@ -252,12 +263,13 @@
         <w:tc>
           <w:tcPr>
             <w:tcW w:type="dxa" w:w="5760"/>
+            <w:tcW w:w="5760" w:type="dxa"/>
             <w:shd w:fill="FFFFFF"/>
             <w:tcMar>
-              <w:top w:w="80" w:type="dxa"/>
-              <w:bottom w:w="80" w:type="dxa"/>
-              <w:left w:w="120" w:type="dxa"/>
-              <w:right w:w="120" w:type="dxa"/>
+              <w:top w:w="60" w:type="dxa"/>
+              <w:bottom w:w="60" w:type="dxa"/>
+              <w:left w:w="80" w:type="dxa"/>
+              <w:right w:w="80" w:type="dxa"/>
             </w:tcMar>
           </w:tcPr>
           <w:p>
@@ -267,7 +279,7 @@
             <w:r>
               <w:rPr>
                 <w:rFonts w:ascii="Times New Roman" w:hAnsi="Times New Roman"/>
-                <w:sz w:val="20"/>
+                <w:sz w:val="19"/>
               </w:rPr>
               <w:t>Securing the Digital Mine - Edge IDS Platform</w:t>
             </w:r>
@@ -275,15 +287,19 @@
         </w:tc>
       </w:tr>
       <w:tr>
+        <w:trPr>
+          <w:cantSplit/>
+        </w:trPr>
         <w:tc>
           <w:tcPr>
             <w:tcW w:type="dxa" w:w="3600"/>
+            <w:tcW w:w="3600" w:type="dxa"/>
             <w:shd w:fill="F8FAFC"/>
             <w:tcMar>
-              <w:top w:w="80" w:type="dxa"/>
-              <w:bottom w:w="80" w:type="dxa"/>
-              <w:left w:w="120" w:type="dxa"/>
-              <w:right w:w="120" w:type="dxa"/>
+              <w:top w:w="60" w:type="dxa"/>
+              <w:bottom w:w="60" w:type="dxa"/>
+              <w:left w:w="80" w:type="dxa"/>
+              <w:right w:w="80" w:type="dxa"/>
             </w:tcMar>
           </w:tcPr>
           <w:p>
@@ -293,7 +309,7 @@
             <w:r>
               <w:rPr>
                 <w:rFonts w:ascii="Times New Roman" w:hAnsi="Times New Roman"/>
-                <w:sz w:val="20"/>
+                <w:sz w:val="19"/>
               </w:rPr>
               <w:t>Package Identifier</w:t>
             </w:r>
@@ -302,12 +318,13 @@
         <w:tc>
           <w:tcPr>
             <w:tcW w:type="dxa" w:w="5760"/>
+            <w:tcW w:w="5760" w:type="dxa"/>
             <w:shd w:fill="F8FAFC"/>
             <w:tcMar>
-              <w:top w:w="80" w:type="dxa"/>
-              <w:bottom w:w="80" w:type="dxa"/>
-              <w:left w:w="120" w:type="dxa"/>
-              <w:right w:w="120" w:type="dxa"/>
+              <w:top w:w="60" w:type="dxa"/>
+              <w:bottom w:w="60" w:type="dxa"/>
+              <w:left w:w="80" w:type="dxa"/>
+              <w:right w:w="80" w:type="dxa"/>
             </w:tcMar>
           </w:tcPr>
           <w:p>
@@ -317,7 +334,7 @@
             <w:r>
               <w:rPr>
                 <w:rFonts w:ascii="Times New Roman" w:hAnsi="Times New Roman"/>
-                <w:sz w:val="20"/>
+                <w:sz w:val="19"/>
               </w:rPr>
               <w:t>@mhiskall282/unesco-mine-sec-cli (GitHub Packages)</w:t>
             </w:r>
@@ -325,15 +342,19 @@
         </w:tc>
       </w:tr>
       <w:tr>
+        <w:trPr>
+          <w:cantSplit/>
+        </w:trPr>
         <w:tc>
           <w:tcPr>
             <w:tcW w:type="dxa" w:w="3600"/>
+            <w:tcW w:w="3600" w:type="dxa"/>
             <w:shd w:fill="FFFFFF"/>
             <w:tcMar>
-              <w:top w:w="80" w:type="dxa"/>
-              <w:bottom w:w="80" w:type="dxa"/>
-              <w:left w:w="120" w:type="dxa"/>
-              <w:right w:w="120" w:type="dxa"/>
+              <w:top w:w="60" w:type="dxa"/>
+              <w:bottom w:w="60" w:type="dxa"/>
+              <w:left w:w="80" w:type="dxa"/>
+              <w:right w:w="80" w:type="dxa"/>
             </w:tcMar>
           </w:tcPr>
           <w:p>
@@ -343,7 +364,7 @@
             <w:r>
               <w:rPr>
                 <w:rFonts w:ascii="Times New Roman" w:hAnsi="Times New Roman"/>
-                <w:sz w:val="20"/>
+                <w:sz w:val="19"/>
               </w:rPr>
               <w:t>Target Hardware</w:t>
             </w:r>
@@ -352,12 +373,13 @@
         <w:tc>
           <w:tcPr>
             <w:tcW w:type="dxa" w:w="5760"/>
+            <w:tcW w:w="5760" w:type="dxa"/>
             <w:shd w:fill="FFFFFF"/>
             <w:tcMar>
-              <w:top w:w="80" w:type="dxa"/>
-              <w:bottom w:w="80" w:type="dxa"/>
-              <w:left w:w="120" w:type="dxa"/>
-              <w:right w:w="120" w:type="dxa"/>
+              <w:top w:w="60" w:type="dxa"/>
+              <w:bottom w:w="60" w:type="dxa"/>
+              <w:left w:w="80" w:type="dxa"/>
+              <w:right w:w="80" w:type="dxa"/>
             </w:tcMar>
           </w:tcPr>
           <w:p>
@@ -367,7 +389,7 @@
             <w:r>
               <w:rPr>
                 <w:rFonts w:ascii="Times New Roman" w:hAnsi="Times New Roman"/>
-                <w:sz w:val="20"/>
+                <w:sz w:val="19"/>
               </w:rPr>
               <w:t>Raspberry Pi 4B/5 (1GB-4GB RAM), Industrial Gateways, AWS EC2</w:t>
             </w:r>
@@ -375,15 +397,19 @@
         </w:tc>
       </w:tr>
       <w:tr>
+        <w:trPr>
+          <w:cantSplit/>
+        </w:trPr>
         <w:tc>
           <w:tcPr>
             <w:tcW w:type="dxa" w:w="3600"/>
+            <w:tcW w:w="3600" w:type="dxa"/>
             <w:shd w:fill="F8FAFC"/>
             <w:tcMar>
-              <w:top w:w="80" w:type="dxa"/>
-              <w:bottom w:w="80" w:type="dxa"/>
-              <w:left w:w="120" w:type="dxa"/>
-              <w:right w:w="120" w:type="dxa"/>
+              <w:top w:w="60" w:type="dxa"/>
+              <w:bottom w:w="60" w:type="dxa"/>
+              <w:left w:w="80" w:type="dxa"/>
+              <w:right w:w="80" w:type="dxa"/>
             </w:tcMar>
           </w:tcPr>
           <w:p>
@@ -393,7 +419,7 @@
             <w:r>
               <w:rPr>
                 <w:rFonts w:ascii="Times New Roman" w:hAnsi="Times New Roman"/>
-                <w:sz w:val="20"/>
+                <w:sz w:val="19"/>
               </w:rPr>
               <w:t>Target Protocols</w:t>
             </w:r>
@@ -402,12 +428,13 @@
         <w:tc>
           <w:tcPr>
             <w:tcW w:type="dxa" w:w="5760"/>
+            <w:tcW w:w="5760" w:type="dxa"/>
             <w:shd w:fill="F8FAFC"/>
             <w:tcMar>
-              <w:top w:w="80" w:type="dxa"/>
-              <w:bottom w:w="80" w:type="dxa"/>
-              <w:left w:w="120" w:type="dxa"/>
-              <w:right w:w="120" w:type="dxa"/>
+              <w:top w:w="60" w:type="dxa"/>
+              <w:bottom w:w="60" w:type="dxa"/>
+              <w:left w:w="80" w:type="dxa"/>
+              <w:right w:w="80" w:type="dxa"/>
             </w:tcMar>
           </w:tcPr>
           <w:p>
@@ -417,7 +444,7 @@
             <w:r>
               <w:rPr>
                 <w:rFonts w:ascii="Times New Roman" w:hAnsi="Times New Roman"/>
-                <w:sz w:val="20"/>
+                <w:sz w:val="19"/>
               </w:rPr>
               <w:t>Modbus RTU/TCP, DNP3, OPC-UA, Ethernet/IP, MQTT</w:t>
             </w:r>
@@ -425,15 +452,19 @@
         </w:tc>
       </w:tr>
       <w:tr>
+        <w:trPr>
+          <w:cantSplit/>
+        </w:trPr>
         <w:tc>
           <w:tcPr>
             <w:tcW w:type="dxa" w:w="3600"/>
+            <w:tcW w:w="3600" w:type="dxa"/>
             <w:shd w:fill="FFFFFF"/>
             <w:tcMar>
-              <w:top w:w="80" w:type="dxa"/>
-              <w:bottom w:w="80" w:type="dxa"/>
-              <w:left w:w="120" w:type="dxa"/>
-              <w:right w:w="120" w:type="dxa"/>
+              <w:top w:w="60" w:type="dxa"/>
+              <w:bottom w:w="60" w:type="dxa"/>
+              <w:left w:w="80" w:type="dxa"/>
+              <w:right w:w="80" w:type="dxa"/>
             </w:tcMar>
           </w:tcPr>
           <w:p>
@@ -443,7 +474,7 @@
             <w:r>
               <w:rPr>
                 <w:rFonts w:ascii="Times New Roman" w:hAnsi="Times New Roman"/>
-                <w:sz w:val="20"/>
+                <w:sz w:val="19"/>
               </w:rPr>
               <w:t>Lead Institution</w:t>
             </w:r>
@@ -452,12 +483,13 @@
         <w:tc>
           <w:tcPr>
             <w:tcW w:type="dxa" w:w="5760"/>
+            <w:tcW w:w="5760" w:type="dxa"/>
             <w:shd w:fill="FFFFFF"/>
             <w:tcMar>
-              <w:top w:w="80" w:type="dxa"/>
-              <w:bottom w:w="80" w:type="dxa"/>
-              <w:left w:w="120" w:type="dxa"/>
-              <w:right w:w="120" w:type="dxa"/>
+              <w:top w:w="60" w:type="dxa"/>
+              <w:bottom w:w="60" w:type="dxa"/>
+              <w:left w:w="80" w:type="dxa"/>
+              <w:right w:w="80" w:type="dxa"/>
             </w:tcMar>
           </w:tcPr>
           <w:p>
@@ -467,7 +499,7 @@
             <w:r>
               <w:rPr>
                 <w:rFonts w:ascii="Times New Roman" w:hAnsi="Times New Roman"/>
-                <w:sz w:val="20"/>
+                <w:sz w:val="19"/>
               </w:rPr>
               <w:t>University of Education, Winneba (UEW) &amp; Kayaba Labs</w:t>
             </w:r>
@@ -475,15 +507,19 @@
         </w:tc>
       </w:tr>
       <w:tr>
+        <w:trPr>
+          <w:cantSplit/>
+        </w:trPr>
         <w:tc>
           <w:tcPr>
             <w:tcW w:type="dxa" w:w="3600"/>
+            <w:tcW w:w="3600" w:type="dxa"/>
             <w:shd w:fill="F8FAFC"/>
             <w:tcMar>
-              <w:top w:w="80" w:type="dxa"/>
-              <w:bottom w:w="80" w:type="dxa"/>
-              <w:left w:w="120" w:type="dxa"/>
-              <w:right w:w="120" w:type="dxa"/>
+              <w:top w:w="60" w:type="dxa"/>
+              <w:bottom w:w="60" w:type="dxa"/>
+              <w:left w:w="80" w:type="dxa"/>
+              <w:right w:w="80" w:type="dxa"/>
             </w:tcMar>
           </w:tcPr>
           <w:p>
@@ -493,7 +529,7 @@
             <w:r>
               <w:rPr>
                 <w:rFonts w:ascii="Times New Roman" w:hAnsi="Times New Roman"/>
-                <w:sz w:val="20"/>
+                <w:sz w:val="19"/>
               </w:rPr>
               <w:t>Forum Submission</w:t>
             </w:r>
@@ -502,12 +538,13 @@
         <w:tc>
           <w:tcPr>
             <w:tcW w:type="dxa" w:w="5760"/>
+            <w:tcW w:w="5760" w:type="dxa"/>
             <w:shd w:fill="F8FAFC"/>
             <w:tcMar>
-              <w:top w:w="80" w:type="dxa"/>
-              <w:bottom w:w="80" w:type="dxa"/>
-              <w:left w:w="120" w:type="dxa"/>
-              <w:right w:w="120" w:type="dxa"/>
+              <w:top w:w="60" w:type="dxa"/>
+              <w:bottom w:w="60" w:type="dxa"/>
+              <w:left w:w="80" w:type="dxa"/>
+              <w:right w:w="80" w:type="dxa"/>
             </w:tcMar>
           </w:tcPr>
           <w:p>
@@ -517,7 +554,7 @@
             <w:r>
               <w:rPr>
                 <w:rFonts w:ascii="Times New Roman" w:hAnsi="Times New Roman"/>
-                <w:sz w:val="20"/>
+                <w:sz w:val="19"/>
               </w:rPr>
               <w:t>Russian-African Forum-Contest of Young Scientists 2026 (UNESCO)</w:t>
             </w:r>
@@ -525,15 +562,19 @@
         </w:tc>
       </w:tr>
       <w:tr>
+        <w:trPr>
+          <w:cantSplit/>
+        </w:trPr>
         <w:tc>
           <w:tcPr>
             <w:tcW w:type="dxa" w:w="3600"/>
+            <w:tcW w:w="3600" w:type="dxa"/>
             <w:shd w:fill="FFFFFF"/>
             <w:tcMar>
-              <w:top w:w="80" w:type="dxa"/>
-              <w:bottom w:w="80" w:type="dxa"/>
-              <w:left w:w="120" w:type="dxa"/>
-              <w:right w:w="120" w:type="dxa"/>
+              <w:top w:w="60" w:type="dxa"/>
+              <w:bottom w:w="60" w:type="dxa"/>
+              <w:left w:w="80" w:type="dxa"/>
+              <w:right w:w="80" w:type="dxa"/>
             </w:tcMar>
           </w:tcPr>
           <w:p>
@@ -543,7 +584,7 @@
             <w:r>
               <w:rPr>
                 <w:rFonts w:ascii="Times New Roman" w:hAnsi="Times New Roman"/>
-                <w:sz w:val="20"/>
+                <w:sz w:val="19"/>
               </w:rPr>
               <w:t>Document Version</w:t>
             </w:r>
@@ -552,12 +593,13 @@
         <w:tc>
           <w:tcPr>
             <w:tcW w:type="dxa" w:w="5760"/>
+            <w:tcW w:w="5760" w:type="dxa"/>
             <w:shd w:fill="FFFFFF"/>
             <w:tcMar>
-              <w:top w:w="80" w:type="dxa"/>
-              <w:bottom w:w="80" w:type="dxa"/>
-              <w:left w:w="120" w:type="dxa"/>
-              <w:right w:w="120" w:type="dxa"/>
+              <w:top w:w="60" w:type="dxa"/>
+              <w:bottom w:w="60" w:type="dxa"/>
+              <w:left w:w="80" w:type="dxa"/>
+              <w:right w:w="80" w:type="dxa"/>
             </w:tcMar>
           </w:tcPr>
           <w:p>
@@ -567,7 +609,7 @@
             <w:r>
               <w:rPr>
                 <w:rFonts w:ascii="Times New Roman" w:hAnsi="Times New Roman"/>
-                <w:sz w:val="20"/>
+                <w:sz w:val="19"/>
               </w:rPr>
               <w:t>v3.0.0 (Production Candidate)</w:t>
             </w:r>
@@ -575,15 +617,19 @@
         </w:tc>
       </w:tr>
       <w:tr>
+        <w:trPr>
+          <w:cantSplit/>
+        </w:trPr>
         <w:tc>
           <w:tcPr>
             <w:tcW w:type="dxa" w:w="3600"/>
+            <w:tcW w:w="3600" w:type="dxa"/>
             <w:shd w:fill="F8FAFC"/>
             <w:tcMar>
-              <w:top w:w="80" w:type="dxa"/>
-              <w:bottom w:w="80" w:type="dxa"/>
-              <w:left w:w="120" w:type="dxa"/>
-              <w:right w:w="120" w:type="dxa"/>
+              <w:top w:w="60" w:type="dxa"/>
+              <w:bottom w:w="60" w:type="dxa"/>
+              <w:left w:w="80" w:type="dxa"/>
+              <w:right w:w="80" w:type="dxa"/>
             </w:tcMar>
           </w:tcPr>
           <w:p>
@@ -593,7 +639,7 @@
             <w:r>
               <w:rPr>
                 <w:rFonts w:ascii="Times New Roman" w:hAnsi="Times New Roman"/>
-                <w:sz w:val="20"/>
+                <w:sz w:val="19"/>
               </w:rPr>
               <w:t>Release Date</w:t>
             </w:r>
@@ -602,12 +648,13 @@
         <w:tc>
           <w:tcPr>
             <w:tcW w:type="dxa" w:w="5760"/>
+            <w:tcW w:w="5760" w:type="dxa"/>
             <w:shd w:fill="F8FAFC"/>
             <w:tcMar>
-              <w:top w:w="80" w:type="dxa"/>
-              <w:bottom w:w="80" w:type="dxa"/>
-              <w:left w:w="120" w:type="dxa"/>
-              <w:right w:w="120" w:type="dxa"/>
+              <w:top w:w="60" w:type="dxa"/>
+              <w:bottom w:w="60" w:type="dxa"/>
+              <w:left w:w="80" w:type="dxa"/>
+              <w:right w:w="80" w:type="dxa"/>
             </w:tcMar>
           </w:tcPr>
           <w:p>
@@ -617,7 +664,7 @@
             <w:r>
               <w:rPr>
                 <w:rFonts w:ascii="Times New Roman" w:hAnsi="Times New Roman"/>
-                <w:sz w:val="20"/>
+                <w:sz w:val="19"/>
               </w:rPr>
               <w:t>August 2026</w:t>
             </w:r>
@@ -633,7 +680,7 @@
     <w:p>
       <w:pPr>
         <w:keepNext/>
-        <w:spacing w:before="320" w:after="120"/>
+        <w:spacing w:before="360" w:after="120"/>
       </w:pPr>
       <w:r>
         <w:rPr>
@@ -648,7 +695,7 @@
     <w:p>
       <w:pPr>
         <w:keepNext/>
-        <w:spacing w:before="240" w:after="80"/>
+        <w:spacing w:before="280" w:after="80"/>
       </w:pPr>
       <w:r>
         <w:rPr>
@@ -702,7 +749,7 @@
     <w:p>
       <w:pPr>
         <w:keepNext/>
-        <w:spacing w:before="240" w:after="80"/>
+        <w:spacing w:before="280" w:after="80"/>
       </w:pPr>
       <w:r>
         <w:rPr>
@@ -756,7 +803,7 @@
     <w:p>
       <w:pPr>
         <w:keepNext/>
-        <w:spacing w:before="240" w:after="80"/>
+        <w:spacing w:before="280" w:after="80"/>
       </w:pPr>
       <w:r>
         <w:rPr>
@@ -810,7 +857,7 @@
     <w:p>
       <w:pPr>
         <w:keepNext/>
-        <w:spacing w:before="320" w:after="120"/>
+        <w:spacing w:before="360" w:after="120"/>
       </w:pPr>
       <w:r>
         <w:rPr>
@@ -901,7 +948,7 @@
     <w:p>
       <w:pPr>
         <w:keepNext/>
-        <w:spacing w:before="320" w:after="120"/>
+        <w:spacing w:before="360" w:after="120"/>
       </w:pPr>
       <w:r>
         <w:rPr>
@@ -935,15 +982,20 @@
         <w:gridCol w:w="2340"/>
       </w:tblGrid>
       <w:tr>
+        <w:trPr>
+          <w:cantSplit/>
+          <w:tblHeader/>
+        </w:trPr>
         <w:tc>
           <w:tcPr>
             <w:tcW w:type="dxa" w:w="1296"/>
+            <w:tcW w:w="1296" w:type="dxa"/>
             <w:shd w:fill="00529B"/>
             <w:tcMar>
-              <w:top w:w="120" w:type="dxa"/>
-              <w:bottom w:w="120" w:type="dxa"/>
-              <w:left w:w="140" w:type="dxa"/>
-              <w:right w:w="140" w:type="dxa"/>
+              <w:top w:w="100" w:type="dxa"/>
+              <w:bottom w:w="100" w:type="dxa"/>
+              <w:left w:w="100" w:type="dxa"/>
+              <w:right w:w="100" w:type="dxa"/>
             </w:tcMar>
           </w:tcPr>
           <w:p>
@@ -955,7 +1007,7 @@
                 <w:rFonts w:ascii="Arial" w:hAnsi="Arial"/>
                 <w:b/>
                 <w:color w:val="FFFFFF"/>
-                <w:sz w:val="20"/>
+                <w:sz w:val="19"/>
               </w:rPr>
               <w:t>Req ID</w:t>
             </w:r>
@@ -964,12 +1016,13 @@
         <w:tc>
           <w:tcPr>
             <w:tcW w:type="dxa" w:w="2592"/>
+            <w:tcW w:w="2592" w:type="dxa"/>
             <w:shd w:fill="00529B"/>
             <w:tcMar>
-              <w:top w:w="120" w:type="dxa"/>
-              <w:bottom w:w="120" w:type="dxa"/>
-              <w:left w:w="140" w:type="dxa"/>
-              <w:right w:w="140" w:type="dxa"/>
+              <w:top w:w="100" w:type="dxa"/>
+              <w:bottom w:w="100" w:type="dxa"/>
+              <w:left w:w="100" w:type="dxa"/>
+              <w:right w:w="100" w:type="dxa"/>
             </w:tcMar>
           </w:tcPr>
           <w:p>
@@ -981,7 +1034,7 @@
                 <w:rFonts w:ascii="Arial" w:hAnsi="Arial"/>
                 <w:b/>
                 <w:color w:val="FFFFFF"/>
-                <w:sz w:val="20"/>
+                <w:sz w:val="19"/>
               </w:rPr>
               <w:t>Requirement Name</w:t>
             </w:r>
@@ -990,12 +1043,13 @@
         <w:tc>
           <w:tcPr>
             <w:tcW w:type="dxa" w:w="1728"/>
+            <w:tcW w:w="1728" w:type="dxa"/>
             <w:shd w:fill="00529B"/>
             <w:tcMar>
-              <w:top w:w="120" w:type="dxa"/>
-              <w:bottom w:w="120" w:type="dxa"/>
-              <w:left w:w="140" w:type="dxa"/>
-              <w:right w:w="140" w:type="dxa"/>
+              <w:top w:w="100" w:type="dxa"/>
+              <w:bottom w:w="100" w:type="dxa"/>
+              <w:left w:w="100" w:type="dxa"/>
+              <w:right w:w="100" w:type="dxa"/>
             </w:tcMar>
           </w:tcPr>
           <w:p>
@@ -1007,7 +1061,7 @@
                 <w:rFonts w:ascii="Arial" w:hAnsi="Arial"/>
                 <w:b/>
                 <w:color w:val="FFFFFF"/>
-                <w:sz w:val="20"/>
+                <w:sz w:val="19"/>
               </w:rPr>
               <w:t>Priority</w:t>
             </w:r>
@@ -1016,12 +1070,13 @@
         <w:tc>
           <w:tcPr>
             <w:tcW w:type="dxa" w:w="3744"/>
+            <w:tcW w:w="3744" w:type="dxa"/>
             <w:shd w:fill="00529B"/>
             <w:tcMar>
-              <w:top w:w="120" w:type="dxa"/>
-              <w:bottom w:w="120" w:type="dxa"/>
-              <w:left w:w="140" w:type="dxa"/>
-              <w:right w:w="140" w:type="dxa"/>
+              <w:top w:w="100" w:type="dxa"/>
+              <w:bottom w:w="100" w:type="dxa"/>
+              <w:left w:w="100" w:type="dxa"/>
+              <w:right w:w="100" w:type="dxa"/>
             </w:tcMar>
           </w:tcPr>
           <w:p>
@@ -1033,7 +1088,7 @@
                 <w:rFonts w:ascii="Arial" w:hAnsi="Arial"/>
                 <w:b/>
                 <w:color w:val="FFFFFF"/>
-                <w:sz w:val="20"/>
+                <w:sz w:val="19"/>
               </w:rPr>
               <w:t>Detailed Functional Description</w:t>
             </w:r>
@@ -1041,15 +1096,19 @@
         </w:tc>
       </w:tr>
       <w:tr>
+        <w:trPr>
+          <w:cantSplit/>
+        </w:trPr>
         <w:tc>
           <w:tcPr>
             <w:tcW w:type="dxa" w:w="1296"/>
+            <w:tcW w:w="1296" w:type="dxa"/>
             <w:shd w:fill="FFFFFF"/>
             <w:tcMar>
-              <w:top w:w="80" w:type="dxa"/>
-              <w:bottom w:w="80" w:type="dxa"/>
-              <w:left w:w="120" w:type="dxa"/>
-              <w:right w:w="120" w:type="dxa"/>
+              <w:top w:w="60" w:type="dxa"/>
+              <w:bottom w:w="60" w:type="dxa"/>
+              <w:left w:w="80" w:type="dxa"/>
+              <w:right w:w="80" w:type="dxa"/>
             </w:tcMar>
           </w:tcPr>
           <w:p>
@@ -1059,7 +1118,7 @@
             <w:r>
               <w:rPr>
                 <w:rFonts w:ascii="Times New Roman" w:hAnsi="Times New Roman"/>
-                <w:sz w:val="20"/>
+                <w:sz w:val="19"/>
               </w:rPr>
               <w:t>FR-01</w:t>
             </w:r>
@@ -1068,12 +1127,13 @@
         <w:tc>
           <w:tcPr>
             <w:tcW w:type="dxa" w:w="2592"/>
+            <w:tcW w:w="2592" w:type="dxa"/>
             <w:shd w:fill="FFFFFF"/>
             <w:tcMar>
-              <w:top w:w="80" w:type="dxa"/>
-              <w:bottom w:w="80" w:type="dxa"/>
-              <w:left w:w="120" w:type="dxa"/>
-              <w:right w:w="120" w:type="dxa"/>
+              <w:top w:w="60" w:type="dxa"/>
+              <w:bottom w:w="60" w:type="dxa"/>
+              <w:left w:w="80" w:type="dxa"/>
+              <w:right w:w="80" w:type="dxa"/>
             </w:tcMar>
           </w:tcPr>
           <w:p>
@@ -1083,7 +1143,7 @@
             <w:r>
               <w:rPr>
                 <w:rFonts w:ascii="Times New Roman" w:hAnsi="Times New Roman"/>
-                <w:sz w:val="20"/>
+                <w:sz w:val="19"/>
               </w:rPr>
               <w:t>Promiscuous Packet Sniffing</w:t>
             </w:r>
@@ -1092,12 +1152,13 @@
         <w:tc>
           <w:tcPr>
             <w:tcW w:type="dxa" w:w="1728"/>
+            <w:tcW w:w="1728" w:type="dxa"/>
             <w:shd w:fill="FFFFFF"/>
             <w:tcMar>
-              <w:top w:w="80" w:type="dxa"/>
-              <w:bottom w:w="80" w:type="dxa"/>
-              <w:left w:w="120" w:type="dxa"/>
-              <w:right w:w="120" w:type="dxa"/>
+              <w:top w:w="60" w:type="dxa"/>
+              <w:bottom w:w="60" w:type="dxa"/>
+              <w:left w:w="80" w:type="dxa"/>
+              <w:right w:w="80" w:type="dxa"/>
             </w:tcMar>
           </w:tcPr>
           <w:p>
@@ -1107,7 +1168,7 @@
             <w:r>
               <w:rPr>
                 <w:rFonts w:ascii="Times New Roman" w:hAnsi="Times New Roman"/>
-                <w:sz w:val="20"/>
+                <w:sz w:val="19"/>
               </w:rPr>
               <w:t>P0 (Must Have)</w:t>
             </w:r>
@@ -1116,12 +1177,13 @@
         <w:tc>
           <w:tcPr>
             <w:tcW w:type="dxa" w:w="3744"/>
+            <w:tcW w:w="3744" w:type="dxa"/>
             <w:shd w:fill="FFFFFF"/>
             <w:tcMar>
-              <w:top w:w="80" w:type="dxa"/>
-              <w:bottom w:w="80" w:type="dxa"/>
-              <w:left w:w="120" w:type="dxa"/>
-              <w:right w:w="120" w:type="dxa"/>
+              <w:top w:w="60" w:type="dxa"/>
+              <w:bottom w:w="60" w:type="dxa"/>
+              <w:left w:w="80" w:type="dxa"/>
+              <w:right w:w="80" w:type="dxa"/>
             </w:tcMar>
           </w:tcPr>
           <w:p>
@@ -1131,7 +1193,7 @@
             <w:r>
               <w:rPr>
                 <w:rFonts w:ascii="Times New Roman" w:hAnsi="Times New Roman"/>
-                <w:sz w:val="20"/>
+                <w:sz w:val="19"/>
               </w:rPr>
               <w:t>The edge CLI agent must bind to any active network interface (Ethernet, Wi-Fi, virtual TAP) and capture raw bidirectional network frames up to 1,000 flows/sec.</w:t>
             </w:r>
@@ -1139,15 +1201,19 @@
         </w:tc>
       </w:tr>
       <w:tr>
+        <w:trPr>
+          <w:cantSplit/>
+        </w:trPr>
         <w:tc>
           <w:tcPr>
             <w:tcW w:type="dxa" w:w="1296"/>
+            <w:tcW w:w="1296" w:type="dxa"/>
             <w:shd w:fill="F8FAFC"/>
             <w:tcMar>
-              <w:top w:w="80" w:type="dxa"/>
-              <w:bottom w:w="80" w:type="dxa"/>
-              <w:left w:w="120" w:type="dxa"/>
-              <w:right w:w="120" w:type="dxa"/>
+              <w:top w:w="60" w:type="dxa"/>
+              <w:bottom w:w="60" w:type="dxa"/>
+              <w:left w:w="80" w:type="dxa"/>
+              <w:right w:w="80" w:type="dxa"/>
             </w:tcMar>
           </w:tcPr>
           <w:p>
@@ -1157,7 +1223,7 @@
             <w:r>
               <w:rPr>
                 <w:rFonts w:ascii="Times New Roman" w:hAnsi="Times New Roman"/>
-                <w:sz w:val="20"/>
+                <w:sz w:val="19"/>
               </w:rPr>
               <w:t>FR-02</w:t>
             </w:r>
@@ -1166,12 +1232,13 @@
         <w:tc>
           <w:tcPr>
             <w:tcW w:type="dxa" w:w="2592"/>
+            <w:tcW w:w="2592" w:type="dxa"/>
             <w:shd w:fill="F8FAFC"/>
             <w:tcMar>
-              <w:top w:w="80" w:type="dxa"/>
-              <w:bottom w:w="80" w:type="dxa"/>
-              <w:left w:w="120" w:type="dxa"/>
-              <w:right w:w="120" w:type="dxa"/>
+              <w:top w:w="60" w:type="dxa"/>
+              <w:bottom w:w="60" w:type="dxa"/>
+              <w:left w:w="80" w:type="dxa"/>
+              <w:right w:w="80" w:type="dxa"/>
             </w:tcMar>
           </w:tcPr>
           <w:p>
@@ -1181,7 +1248,7 @@
             <w:r>
               <w:rPr>
                 <w:rFonts w:ascii="Times New Roman" w:hAnsi="Times New Roman"/>
-                <w:sz w:val="20"/>
+                <w:sz w:val="19"/>
               </w:rPr>
               <w:t>BWOA Feature Pruning</w:t>
             </w:r>
@@ -1190,12 +1257,13 @@
         <w:tc>
           <w:tcPr>
             <w:tcW w:type="dxa" w:w="1728"/>
+            <w:tcW w:w="1728" w:type="dxa"/>
             <w:shd w:fill="F8FAFC"/>
             <w:tcMar>
-              <w:top w:w="80" w:type="dxa"/>
-              <w:bottom w:w="80" w:type="dxa"/>
-              <w:left w:w="120" w:type="dxa"/>
-              <w:right w:w="120" w:type="dxa"/>
+              <w:top w:w="60" w:type="dxa"/>
+              <w:bottom w:w="60" w:type="dxa"/>
+              <w:left w:w="80" w:type="dxa"/>
+              <w:right w:w="80" w:type="dxa"/>
             </w:tcMar>
           </w:tcPr>
           <w:p>
@@ -1205,7 +1273,7 @@
             <w:r>
               <w:rPr>
                 <w:rFonts w:ascii="Times New Roman" w:hAnsi="Times New Roman"/>
-                <w:sz w:val="20"/>
+                <w:sz w:val="19"/>
               </w:rPr>
               <w:t>P0 (Must Have)</w:t>
             </w:r>
@@ -1214,12 +1282,13 @@
         <w:tc>
           <w:tcPr>
             <w:tcW w:type="dxa" w:w="3744"/>
+            <w:tcW w:w="3744" w:type="dxa"/>
             <w:shd w:fill="F8FAFC"/>
             <w:tcMar>
-              <w:top w:w="80" w:type="dxa"/>
-              <w:bottom w:w="80" w:type="dxa"/>
-              <w:left w:w="120" w:type="dxa"/>
-              <w:right w:w="120" w:type="dxa"/>
+              <w:top w:w="60" w:type="dxa"/>
+              <w:bottom w:w="60" w:type="dxa"/>
+              <w:left w:w="80" w:type="dxa"/>
+              <w:right w:w="80" w:type="dxa"/>
             </w:tcMar>
           </w:tcPr>
           <w:p>
@@ -1229,7 +1298,7 @@
             <w:r>
               <w:rPr>
                 <w:rFonts w:ascii="Times New Roman" w:hAnsi="Times New Roman"/>
-                <w:sz w:val="20"/>
+                <w:sz w:val="19"/>
               </w:rPr>
               <w:t>The system must automatically isolate and extract exactly the 10 BWOA-selected features from raw packet headers, achieving a 75.61% telemetry data reduction.</w:t>
             </w:r>
@@ -1237,15 +1306,19 @@
         </w:tc>
       </w:tr>
       <w:tr>
+        <w:trPr>
+          <w:cantSplit/>
+        </w:trPr>
         <w:tc>
           <w:tcPr>
             <w:tcW w:type="dxa" w:w="1296"/>
+            <w:tcW w:w="1296" w:type="dxa"/>
             <w:shd w:fill="FFFFFF"/>
             <w:tcMar>
-              <w:top w:w="80" w:type="dxa"/>
-              <w:bottom w:w="80" w:type="dxa"/>
-              <w:left w:w="120" w:type="dxa"/>
-              <w:right w:w="120" w:type="dxa"/>
+              <w:top w:w="60" w:type="dxa"/>
+              <w:bottom w:w="60" w:type="dxa"/>
+              <w:left w:w="80" w:type="dxa"/>
+              <w:right w:w="80" w:type="dxa"/>
             </w:tcMar>
           </w:tcPr>
           <w:p>
@@ -1255,7 +1328,7 @@
             <w:r>
               <w:rPr>
                 <w:rFonts w:ascii="Times New Roman" w:hAnsi="Times New Roman"/>
-                <w:sz w:val="20"/>
+                <w:sz w:val="19"/>
               </w:rPr>
               <w:t>FR-03</w:t>
             </w:r>
@@ -1264,12 +1337,13 @@
         <w:tc>
           <w:tcPr>
             <w:tcW w:type="dxa" w:w="2592"/>
+            <w:tcW w:w="2592" w:type="dxa"/>
             <w:shd w:fill="FFFFFF"/>
             <w:tcMar>
-              <w:top w:w="80" w:type="dxa"/>
-              <w:bottom w:w="80" w:type="dxa"/>
-              <w:left w:w="120" w:type="dxa"/>
-              <w:right w:w="120" w:type="dxa"/>
+              <w:top w:w="60" w:type="dxa"/>
+              <w:bottom w:w="60" w:type="dxa"/>
+              <w:left w:w="80" w:type="dxa"/>
+              <w:right w:w="80" w:type="dxa"/>
             </w:tcMar>
           </w:tcPr>
           <w:p>
@@ -1279,7 +1353,7 @@
             <w:r>
               <w:rPr>
                 <w:rFonts w:ascii="Times New Roman" w:hAnsi="Times New Roman"/>
-                <w:sz w:val="20"/>
+                <w:sz w:val="19"/>
               </w:rPr>
               <w:t>Multi-Class Attack Classification</w:t>
             </w:r>
@@ -1288,12 +1362,13 @@
         <w:tc>
           <w:tcPr>
             <w:tcW w:type="dxa" w:w="1728"/>
+            <w:tcW w:w="1728" w:type="dxa"/>
             <w:shd w:fill="FFFFFF"/>
             <w:tcMar>
-              <w:top w:w="80" w:type="dxa"/>
-              <w:bottom w:w="80" w:type="dxa"/>
-              <w:left w:w="120" w:type="dxa"/>
-              <w:right w:w="120" w:type="dxa"/>
+              <w:top w:w="60" w:type="dxa"/>
+              <w:bottom w:w="60" w:type="dxa"/>
+              <w:left w:w="80" w:type="dxa"/>
+              <w:right w:w="80" w:type="dxa"/>
             </w:tcMar>
           </w:tcPr>
           <w:p>
@@ -1303,7 +1378,7 @@
             <w:r>
               <w:rPr>
                 <w:rFonts w:ascii="Times New Roman" w:hAnsi="Times New Roman"/>
-                <w:sz w:val="20"/>
+                <w:sz w:val="19"/>
               </w:rPr>
               <w:t>P0 (Must Have)</w:t>
             </w:r>
@@ -1312,12 +1387,13 @@
         <w:tc>
           <w:tcPr>
             <w:tcW w:type="dxa" w:w="3744"/>
+            <w:tcW w:w="3744" w:type="dxa"/>
             <w:shd w:fill="FFFFFF"/>
             <w:tcMar>
-              <w:top w:w="80" w:type="dxa"/>
-              <w:bottom w:w="80" w:type="dxa"/>
-              <w:left w:w="120" w:type="dxa"/>
-              <w:right w:w="120" w:type="dxa"/>
+              <w:top w:w="60" w:type="dxa"/>
+              <w:bottom w:w="60" w:type="dxa"/>
+              <w:left w:w="80" w:type="dxa"/>
+              <w:right w:w="80" w:type="dxa"/>
             </w:tcMar>
           </w:tcPr>
           <w:p>
@@ -1327,7 +1403,7 @@
             <w:r>
               <w:rPr>
                 <w:rFonts w:ascii="Times New Roman" w:hAnsi="Times New Roman"/>
-                <w:sz w:val="20"/>
+                <w:sz w:val="19"/>
               </w:rPr>
               <w:t>The deep learning inference engine must classify incoming flows into five distinct categories: Normal, Denial of Service (DoS), Network Probing, Remote-to-Local (R2L), and User-to-Root (U2R).</w:t>
             </w:r>
@@ -1335,15 +1411,19 @@
         </w:tc>
       </w:tr>
       <w:tr>
+        <w:trPr>
+          <w:cantSplit/>
+        </w:trPr>
         <w:tc>
           <w:tcPr>
             <w:tcW w:type="dxa" w:w="1296"/>
+            <w:tcW w:w="1296" w:type="dxa"/>
             <w:shd w:fill="F8FAFC"/>
             <w:tcMar>
-              <w:top w:w="80" w:type="dxa"/>
-              <w:bottom w:w="80" w:type="dxa"/>
-              <w:left w:w="120" w:type="dxa"/>
-              <w:right w:w="120" w:type="dxa"/>
+              <w:top w:w="60" w:type="dxa"/>
+              <w:bottom w:w="60" w:type="dxa"/>
+              <w:left w:w="80" w:type="dxa"/>
+              <w:right w:w="80" w:type="dxa"/>
             </w:tcMar>
           </w:tcPr>
           <w:p>
@@ -1353,7 +1433,7 @@
             <w:r>
               <w:rPr>
                 <w:rFonts w:ascii="Times New Roman" w:hAnsi="Times New Roman"/>
-                <w:sz w:val="20"/>
+                <w:sz w:val="19"/>
               </w:rPr>
               <w:t>FR-04</w:t>
             </w:r>
@@ -1362,12 +1442,13 @@
         <w:tc>
           <w:tcPr>
             <w:tcW w:type="dxa" w:w="2592"/>
+            <w:tcW w:w="2592" w:type="dxa"/>
             <w:shd w:fill="F8FAFC"/>
             <w:tcMar>
-              <w:top w:w="80" w:type="dxa"/>
-              <w:bottom w:w="80" w:type="dxa"/>
-              <w:left w:w="120" w:type="dxa"/>
-              <w:right w:w="120" w:type="dxa"/>
+              <w:top w:w="60" w:type="dxa"/>
+              <w:bottom w:w="60" w:type="dxa"/>
+              <w:left w:w="80" w:type="dxa"/>
+              <w:right w:w="80" w:type="dxa"/>
             </w:tcMar>
           </w:tcPr>
           <w:p>
@@ -1377,7 +1458,7 @@
             <w:r>
               <w:rPr>
                 <w:rFonts w:ascii="Times New Roman" w:hAnsi="Times New Roman"/>
-                <w:sz w:val="20"/>
+                <w:sz w:val="19"/>
               </w:rPr>
               <w:t>Float16 Quantized Inference</w:t>
             </w:r>
@@ -1386,12 +1467,13 @@
         <w:tc>
           <w:tcPr>
             <w:tcW w:type="dxa" w:w="1728"/>
+            <w:tcW w:w="1728" w:type="dxa"/>
             <w:shd w:fill="F8FAFC"/>
             <w:tcMar>
-              <w:top w:w="80" w:type="dxa"/>
-              <w:bottom w:w="80" w:type="dxa"/>
-              <w:left w:w="120" w:type="dxa"/>
-              <w:right w:w="120" w:type="dxa"/>
+              <w:top w:w="60" w:type="dxa"/>
+              <w:bottom w:w="60" w:type="dxa"/>
+              <w:left w:w="80" w:type="dxa"/>
+              <w:right w:w="80" w:type="dxa"/>
             </w:tcMar>
           </w:tcPr>
           <w:p>
@@ -1401,7 +1483,7 @@
             <w:r>
               <w:rPr>
                 <w:rFonts w:ascii="Times New Roman" w:hAnsi="Times New Roman"/>
-                <w:sz w:val="20"/>
+                <w:sz w:val="19"/>
               </w:rPr>
               <w:t>P0 (Must Have)</w:t>
             </w:r>
@@ -1410,12 +1492,13 @@
         <w:tc>
           <w:tcPr>
             <w:tcW w:type="dxa" w:w="3744"/>
+            <w:tcW w:w="3744" w:type="dxa"/>
             <w:shd w:fill="F8FAFC"/>
             <w:tcMar>
-              <w:top w:w="80" w:type="dxa"/>
-              <w:bottom w:w="80" w:type="dxa"/>
-              <w:left w:w="120" w:type="dxa"/>
-              <w:right w:w="120" w:type="dxa"/>
+              <w:top w:w="60" w:type="dxa"/>
+              <w:bottom w:w="60" w:type="dxa"/>
+              <w:left w:w="80" w:type="dxa"/>
+              <w:right w:w="80" w:type="dxa"/>
             </w:tcMar>
           </w:tcPr>
           <w:p>
@@ -1425,7 +1508,7 @@
             <w:r>
               <w:rPr>
                 <w:rFonts w:ascii="Times New Roman" w:hAnsi="Times New Roman"/>
-                <w:sz w:val="20"/>
+                <w:sz w:val="19"/>
               </w:rPr>
               <w:t>The model must execute via a quantized Float16 TensorFlow Lite engine to achieve single-sample inference latency of less than 1.0 millisecond on ARM Cortex-A72 hardware.</w:t>
             </w:r>
@@ -1433,15 +1516,19 @@
         </w:tc>
       </w:tr>
       <w:tr>
+        <w:trPr>
+          <w:cantSplit/>
+        </w:trPr>
         <w:tc>
           <w:tcPr>
             <w:tcW w:type="dxa" w:w="1296"/>
+            <w:tcW w:w="1296" w:type="dxa"/>
             <w:shd w:fill="FFFFFF"/>
             <w:tcMar>
-              <w:top w:w="80" w:type="dxa"/>
-              <w:bottom w:w="80" w:type="dxa"/>
-              <w:left w:w="120" w:type="dxa"/>
-              <w:right w:w="120" w:type="dxa"/>
+              <w:top w:w="60" w:type="dxa"/>
+              <w:bottom w:w="60" w:type="dxa"/>
+              <w:left w:w="80" w:type="dxa"/>
+              <w:right w:w="80" w:type="dxa"/>
             </w:tcMar>
           </w:tcPr>
           <w:p>
@@ -1451,7 +1538,7 @@
             <w:r>
               <w:rPr>
                 <w:rFonts w:ascii="Times New Roman" w:hAnsi="Times New Roman"/>
-                <w:sz w:val="20"/>
+                <w:sz w:val="19"/>
               </w:rPr>
               <w:t>FR-05</w:t>
             </w:r>
@@ -1460,12 +1547,13 @@
         <w:tc>
           <w:tcPr>
             <w:tcW w:type="dxa" w:w="2592"/>
+            <w:tcW w:w="2592" w:type="dxa"/>
             <w:shd w:fill="FFFFFF"/>
             <w:tcMar>
-              <w:top w:w="80" w:type="dxa"/>
-              <w:bottom w:w="80" w:type="dxa"/>
-              <w:left w:w="120" w:type="dxa"/>
-              <w:right w:w="120" w:type="dxa"/>
+              <w:top w:w="60" w:type="dxa"/>
+              <w:bottom w:w="60" w:type="dxa"/>
+              <w:left w:w="80" w:type="dxa"/>
+              <w:right w:w="80" w:type="dxa"/>
             </w:tcMar>
           </w:tcPr>
           <w:p>
@@ -1475,7 +1563,7 @@
             <w:r>
               <w:rPr>
                 <w:rFonts w:ascii="Times New Roman" w:hAnsi="Times New Roman"/>
-                <w:sz w:val="20"/>
+                <w:sz w:val="19"/>
               </w:rPr>
               <w:t>Interactive CLI Wizard</w:t>
             </w:r>
@@ -1484,12 +1572,13 @@
         <w:tc>
           <w:tcPr>
             <w:tcW w:type="dxa" w:w="1728"/>
+            <w:tcW w:w="1728" w:type="dxa"/>
             <w:shd w:fill="FFFFFF"/>
             <w:tcMar>
-              <w:top w:w="80" w:type="dxa"/>
-              <w:bottom w:w="80" w:type="dxa"/>
-              <w:left w:w="120" w:type="dxa"/>
-              <w:right w:w="120" w:type="dxa"/>
+              <w:top w:w="60" w:type="dxa"/>
+              <w:bottom w:w="60" w:type="dxa"/>
+              <w:left w:w="80" w:type="dxa"/>
+              <w:right w:w="80" w:type="dxa"/>
             </w:tcMar>
           </w:tcPr>
           <w:p>
@@ -1499,7 +1588,7 @@
             <w:r>
               <w:rPr>
                 <w:rFonts w:ascii="Times New Roman" w:hAnsi="Times New Roman"/>
-                <w:sz w:val="20"/>
+                <w:sz w:val="19"/>
               </w:rPr>
               <w:t>P1 (Should Have)</w:t>
             </w:r>
@@ -1508,12 +1597,13 @@
         <w:tc>
           <w:tcPr>
             <w:tcW w:type="dxa" w:w="3744"/>
+            <w:tcW w:w="3744" w:type="dxa"/>
             <w:shd w:fill="FFFFFF"/>
             <w:tcMar>
-              <w:top w:w="80" w:type="dxa"/>
-              <w:bottom w:w="80" w:type="dxa"/>
-              <w:left w:w="120" w:type="dxa"/>
-              <w:right w:w="120" w:type="dxa"/>
+              <w:top w:w="60" w:type="dxa"/>
+              <w:bottom w:w="60" w:type="dxa"/>
+              <w:left w:w="80" w:type="dxa"/>
+              <w:right w:w="80" w:type="dxa"/>
             </w:tcMar>
           </w:tcPr>
           <w:p>
@@ -1523,7 +1613,7 @@
             <w:r>
               <w:rPr>
                 <w:rFonts w:ascii="Times New Roman" w:hAnsi="Times New Roman"/>
-                <w:sz w:val="20"/>
+                <w:sz w:val="19"/>
               </w:rPr>
               <w:t>When launched without parameters, the CLI sniffer must prompt the operator interactively for target API URL, network interface, and authentication bearer token.</w:t>
             </w:r>
@@ -1531,15 +1621,19 @@
         </w:tc>
       </w:tr>
       <w:tr>
+        <w:trPr>
+          <w:cantSplit/>
+        </w:trPr>
         <w:tc>
           <w:tcPr>
             <w:tcW w:type="dxa" w:w="1296"/>
+            <w:tcW w:w="1296" w:type="dxa"/>
             <w:shd w:fill="F8FAFC"/>
             <w:tcMar>
-              <w:top w:w="80" w:type="dxa"/>
-              <w:bottom w:w="80" w:type="dxa"/>
-              <w:left w:w="120" w:type="dxa"/>
-              <w:right w:w="120" w:type="dxa"/>
+              <w:top w:w="60" w:type="dxa"/>
+              <w:bottom w:w="60" w:type="dxa"/>
+              <w:left w:w="80" w:type="dxa"/>
+              <w:right w:w="80" w:type="dxa"/>
             </w:tcMar>
           </w:tcPr>
           <w:p>
@@ -1549,7 +1643,7 @@
             <w:r>
               <w:rPr>
                 <w:rFonts w:ascii="Times New Roman" w:hAnsi="Times New Roman"/>
-                <w:sz w:val="20"/>
+                <w:sz w:val="19"/>
               </w:rPr>
               <w:t>FR-06</w:t>
             </w:r>
@@ -1558,12 +1652,13 @@
         <w:tc>
           <w:tcPr>
             <w:tcW w:type="dxa" w:w="2592"/>
+            <w:tcW w:w="2592" w:type="dxa"/>
             <w:shd w:fill="F8FAFC"/>
             <w:tcMar>
-              <w:top w:w="80" w:type="dxa"/>
-              <w:bottom w:w="80" w:type="dxa"/>
-              <w:left w:w="120" w:type="dxa"/>
-              <w:right w:w="120" w:type="dxa"/>
+              <w:top w:w="60" w:type="dxa"/>
+              <w:bottom w:w="60" w:type="dxa"/>
+              <w:left w:w="80" w:type="dxa"/>
+              <w:right w:w="80" w:type="dxa"/>
             </w:tcMar>
           </w:tcPr>
           <w:p>
@@ -1573,7 +1668,7 @@
             <w:r>
               <w:rPr>
                 <w:rFonts w:ascii="Times New Roman" w:hAnsi="Times New Roman"/>
-                <w:sz w:val="20"/>
+                <w:sz w:val="19"/>
               </w:rPr>
               <w:t>Headless Daemon Execution</w:t>
             </w:r>
@@ -1582,12 +1677,13 @@
         <w:tc>
           <w:tcPr>
             <w:tcW w:type="dxa" w:w="1728"/>
+            <w:tcW w:w="1728" w:type="dxa"/>
             <w:shd w:fill="F8FAFC"/>
             <w:tcMar>
-              <w:top w:w="80" w:type="dxa"/>
-              <w:bottom w:w="80" w:type="dxa"/>
-              <w:left w:w="120" w:type="dxa"/>
-              <w:right w:w="120" w:type="dxa"/>
+              <w:top w:w="60" w:type="dxa"/>
+              <w:bottom w:w="60" w:type="dxa"/>
+              <w:left w:w="80" w:type="dxa"/>
+              <w:right w:w="80" w:type="dxa"/>
             </w:tcMar>
           </w:tcPr>
           <w:p>
@@ -1597,7 +1693,7 @@
             <w:r>
               <w:rPr>
                 <w:rFonts w:ascii="Times New Roman" w:hAnsi="Times New Roman"/>
-                <w:sz w:val="20"/>
+                <w:sz w:val="19"/>
               </w:rPr>
               <w:t>P1 (Should Have)</w:t>
             </w:r>
@@ -1606,12 +1702,13 @@
         <w:tc>
           <w:tcPr>
             <w:tcW w:type="dxa" w:w="3744"/>
+            <w:tcW w:w="3744" w:type="dxa"/>
             <w:shd w:fill="F8FAFC"/>
             <w:tcMar>
-              <w:top w:w="80" w:type="dxa"/>
-              <w:bottom w:w="80" w:type="dxa"/>
-              <w:left w:w="120" w:type="dxa"/>
-              <w:right w:w="120" w:type="dxa"/>
+              <w:top w:w="60" w:type="dxa"/>
+              <w:bottom w:w="60" w:type="dxa"/>
+              <w:left w:w="80" w:type="dxa"/>
+              <w:right w:w="80" w:type="dxa"/>
             </w:tcMar>
           </w:tcPr>
           <w:p>
@@ -1621,7 +1718,7 @@
             <w:r>
               <w:rPr>
                 <w:rFonts w:ascii="Times New Roman" w:hAnsi="Times New Roman"/>
-                <w:sz w:val="20"/>
+                <w:sz w:val="19"/>
               </w:rPr>
               <w:t>The CLI sniffer must support non-interactive execution via command-line flags (--url, --key, --interface) for integration into Linux systemd services and cron schedules.</w:t>
             </w:r>
@@ -1629,15 +1726,19 @@
         </w:tc>
       </w:tr>
       <w:tr>
+        <w:trPr>
+          <w:cantSplit/>
+        </w:trPr>
         <w:tc>
           <w:tcPr>
             <w:tcW w:type="dxa" w:w="1296"/>
+            <w:tcW w:w="1296" w:type="dxa"/>
             <w:shd w:fill="FFFFFF"/>
             <w:tcMar>
-              <w:top w:w="80" w:type="dxa"/>
-              <w:bottom w:w="80" w:type="dxa"/>
-              <w:left w:w="120" w:type="dxa"/>
-              <w:right w:w="120" w:type="dxa"/>
+              <w:top w:w="60" w:type="dxa"/>
+              <w:bottom w:w="60" w:type="dxa"/>
+              <w:left w:w="80" w:type="dxa"/>
+              <w:right w:w="80" w:type="dxa"/>
             </w:tcMar>
           </w:tcPr>
           <w:p>
@@ -1647,7 +1748,7 @@
             <w:r>
               <w:rPr>
                 <w:rFonts w:ascii="Times New Roman" w:hAnsi="Times New Roman"/>
-                <w:sz w:val="20"/>
+                <w:sz w:val="19"/>
               </w:rPr>
               <w:t>FR-07</w:t>
             </w:r>
@@ -1656,12 +1757,13 @@
         <w:tc>
           <w:tcPr>
             <w:tcW w:type="dxa" w:w="2592"/>
+            <w:tcW w:w="2592" w:type="dxa"/>
             <w:shd w:fill="FFFFFF"/>
             <w:tcMar>
-              <w:top w:w="80" w:type="dxa"/>
-              <w:bottom w:w="80" w:type="dxa"/>
-              <w:left w:w="120" w:type="dxa"/>
-              <w:right w:w="120" w:type="dxa"/>
+              <w:top w:w="60" w:type="dxa"/>
+              <w:bottom w:w="60" w:type="dxa"/>
+              <w:left w:w="80" w:type="dxa"/>
+              <w:right w:w="80" w:type="dxa"/>
             </w:tcMar>
           </w:tcPr>
           <w:p>
@@ -1671,7 +1773,7 @@
             <w:r>
               <w:rPr>
                 <w:rFonts w:ascii="Times New Roman" w:hAnsi="Times New Roman"/>
-                <w:sz w:val="20"/>
+                <w:sz w:val="19"/>
               </w:rPr>
               <w:t>Live Dashboard Alerting</w:t>
             </w:r>
@@ -1680,12 +1782,13 @@
         <w:tc>
           <w:tcPr>
             <w:tcW w:type="dxa" w:w="1728"/>
+            <w:tcW w:w="1728" w:type="dxa"/>
             <w:shd w:fill="FFFFFF"/>
             <w:tcMar>
-              <w:top w:w="80" w:type="dxa"/>
-              <w:bottom w:w="80" w:type="dxa"/>
-              <w:left w:w="120" w:type="dxa"/>
-              <w:right w:w="120" w:type="dxa"/>
+              <w:top w:w="60" w:type="dxa"/>
+              <w:bottom w:w="60" w:type="dxa"/>
+              <w:left w:w="80" w:type="dxa"/>
+              <w:right w:w="80" w:type="dxa"/>
             </w:tcMar>
           </w:tcPr>
           <w:p>
@@ -1695,7 +1798,7 @@
             <w:r>
               <w:rPr>
                 <w:rFonts w:ascii="Times New Roman" w:hAnsi="Times New Roman"/>
-                <w:sz w:val="20"/>
+                <w:sz w:val="19"/>
               </w:rPr>
               <w:t>P1 (Should Have)</w:t>
             </w:r>
@@ -1704,12 +1807,13 @@
         <w:tc>
           <w:tcPr>
             <w:tcW w:type="dxa" w:w="3744"/>
+            <w:tcW w:w="3744" w:type="dxa"/>
             <w:shd w:fill="FFFFFF"/>
             <w:tcMar>
-              <w:top w:w="80" w:type="dxa"/>
-              <w:bottom w:w="80" w:type="dxa"/>
-              <w:left w:w="120" w:type="dxa"/>
-              <w:right w:w="120" w:type="dxa"/>
+              <w:top w:w="60" w:type="dxa"/>
+              <w:bottom w:w="60" w:type="dxa"/>
+              <w:left w:w="80" w:type="dxa"/>
+              <w:right w:w="80" w:type="dxa"/>
             </w:tcMar>
           </w:tcPr>
           <w:p>
@@ -1719,7 +1823,7 @@
             <w:r>
               <w:rPr>
                 <w:rFonts w:ascii="Times New Roman" w:hAnsi="Times New Roman"/>
-                <w:sz w:val="20"/>
+                <w:sz w:val="19"/>
               </w:rPr>
               <w:t>The Laravel SaaS dashboard must ingest flow telemetry via /api/external/analyze and broadcast real-time Livewire events with confidence scores and threat severity levels.</w:t>
             </w:r>
@@ -1727,15 +1831,19 @@
         </w:tc>
       </w:tr>
       <w:tr>
+        <w:trPr>
+          <w:cantSplit/>
+        </w:trPr>
         <w:tc>
           <w:tcPr>
             <w:tcW w:type="dxa" w:w="1296"/>
+            <w:tcW w:w="1296" w:type="dxa"/>
             <w:shd w:fill="F8FAFC"/>
             <w:tcMar>
-              <w:top w:w="80" w:type="dxa"/>
-              <w:bottom w:w="80" w:type="dxa"/>
-              <w:left w:w="120" w:type="dxa"/>
-              <w:right w:w="120" w:type="dxa"/>
+              <w:top w:w="60" w:type="dxa"/>
+              <w:bottom w:w="60" w:type="dxa"/>
+              <w:left w:w="80" w:type="dxa"/>
+              <w:right w:w="80" w:type="dxa"/>
             </w:tcMar>
           </w:tcPr>
           <w:p>
@@ -1745,7 +1853,7 @@
             <w:r>
               <w:rPr>
                 <w:rFonts w:ascii="Times New Roman" w:hAnsi="Times New Roman"/>
-                <w:sz w:val="20"/>
+                <w:sz w:val="19"/>
               </w:rPr>
               <w:t>FR-08</w:t>
             </w:r>
@@ -1754,12 +1862,13 @@
         <w:tc>
           <w:tcPr>
             <w:tcW w:type="dxa" w:w="2592"/>
+            <w:tcW w:w="2592" w:type="dxa"/>
             <w:shd w:fill="F8FAFC"/>
             <w:tcMar>
-              <w:top w:w="80" w:type="dxa"/>
-              <w:bottom w:w="80" w:type="dxa"/>
-              <w:left w:w="120" w:type="dxa"/>
-              <w:right w:w="120" w:type="dxa"/>
+              <w:top w:w="60" w:type="dxa"/>
+              <w:bottom w:w="60" w:type="dxa"/>
+              <w:left w:w="80" w:type="dxa"/>
+              <w:right w:w="80" w:type="dxa"/>
             </w:tcMar>
           </w:tcPr>
           <w:p>
@@ -1769,7 +1878,7 @@
             <w:r>
               <w:rPr>
                 <w:rFonts w:ascii="Times New Roman" w:hAnsi="Times New Roman"/>
-                <w:sz w:val="20"/>
+                <w:sz w:val="19"/>
               </w:rPr>
               <w:t>Compliance Audit Trail</w:t>
             </w:r>
@@ -1778,12 +1887,13 @@
         <w:tc>
           <w:tcPr>
             <w:tcW w:type="dxa" w:w="1728"/>
+            <w:tcW w:w="1728" w:type="dxa"/>
             <w:shd w:fill="F8FAFC"/>
             <w:tcMar>
-              <w:top w:w="80" w:type="dxa"/>
-              <w:bottom w:w="80" w:type="dxa"/>
-              <w:left w:w="120" w:type="dxa"/>
-              <w:right w:w="120" w:type="dxa"/>
+              <w:top w:w="60" w:type="dxa"/>
+              <w:bottom w:w="60" w:type="dxa"/>
+              <w:left w:w="80" w:type="dxa"/>
+              <w:right w:w="80" w:type="dxa"/>
             </w:tcMar>
           </w:tcPr>
           <w:p>
@@ -1793,7 +1903,7 @@
             <w:r>
               <w:rPr>
                 <w:rFonts w:ascii="Times New Roman" w:hAnsi="Times New Roman"/>
-                <w:sz w:val="20"/>
+                <w:sz w:val="19"/>
               </w:rPr>
               <w:t>P2 (Nice to Have)</w:t>
             </w:r>
@@ -1802,12 +1912,13 @@
         <w:tc>
           <w:tcPr>
             <w:tcW w:type="dxa" w:w="3744"/>
+            <w:tcW w:w="3744" w:type="dxa"/>
             <w:shd w:fill="F8FAFC"/>
             <w:tcMar>
-              <w:top w:w="80" w:type="dxa"/>
-              <w:bottom w:w="80" w:type="dxa"/>
-              <w:left w:w="120" w:type="dxa"/>
-              <w:right w:w="120" w:type="dxa"/>
+              <w:top w:w="60" w:type="dxa"/>
+              <w:bottom w:w="60" w:type="dxa"/>
+              <w:left w:w="80" w:type="dxa"/>
+              <w:right w:w="80" w:type="dxa"/>
             </w:tcMar>
           </w:tcPr>
           <w:p>
@@ -1817,7 +1928,7 @@
             <w:r>
               <w:rPr>
                 <w:rFonts w:ascii="Times New Roman" w:hAnsi="Times New Roman"/>
-                <w:sz w:val="20"/>
+                <w:sz w:val="19"/>
               </w:rPr>
               <w:t>All detected anomalies, affected IP endpoints, and operator acknowledgment timestamps must be recorded in an immutable audit log for regulatory compliance reporting.</w:t>
             </w:r>
@@ -1833,7 +1944,7 @@
     <w:p>
       <w:pPr>
         <w:keepNext/>
-        <w:spacing w:before="320" w:after="120"/>
+        <w:spacing w:before="360" w:after="120"/>
       </w:pPr>
       <w:r>
         <w:rPr>
@@ -1867,15 +1978,20 @@
         <w:gridCol w:w="2340"/>
       </w:tblGrid>
       <w:tr>
+        <w:trPr>
+          <w:cantSplit/>
+          <w:tblHeader/>
+        </w:trPr>
         <w:tc>
           <w:tcPr>
             <w:tcW w:type="dxa" w:w="1440"/>
+            <w:tcW w:w="1440" w:type="dxa"/>
             <w:shd w:fill="00529B"/>
             <w:tcMar>
-              <w:top w:w="120" w:type="dxa"/>
-              <w:bottom w:w="120" w:type="dxa"/>
-              <w:left w:w="140" w:type="dxa"/>
-              <w:right w:w="140" w:type="dxa"/>
+              <w:top w:w="100" w:type="dxa"/>
+              <w:bottom w:w="100" w:type="dxa"/>
+              <w:left w:w="100" w:type="dxa"/>
+              <w:right w:w="100" w:type="dxa"/>
             </w:tcMar>
           </w:tcPr>
           <w:p>
@@ -1887,7 +2003,7 @@
                 <w:rFonts w:ascii="Arial" w:hAnsi="Arial"/>
                 <w:b/>
                 <w:color w:val="FFFFFF"/>
-                <w:sz w:val="20"/>
+                <w:sz w:val="19"/>
               </w:rPr>
               <w:t>Req ID</w:t>
             </w:r>
@@ -1896,12 +2012,13 @@
         <w:tc>
           <w:tcPr>
             <w:tcW w:type="dxa" w:w="2016"/>
+            <w:tcW w:w="2015" w:type="dxa"/>
             <w:shd w:fill="00529B"/>
             <w:tcMar>
-              <w:top w:w="120" w:type="dxa"/>
-              <w:bottom w:w="120" w:type="dxa"/>
-              <w:left w:w="140" w:type="dxa"/>
-              <w:right w:w="140" w:type="dxa"/>
+              <w:top w:w="100" w:type="dxa"/>
+              <w:bottom w:w="100" w:type="dxa"/>
+              <w:left w:w="100" w:type="dxa"/>
+              <w:right w:w="100" w:type="dxa"/>
             </w:tcMar>
           </w:tcPr>
           <w:p>
@@ -1913,7 +2030,7 @@
                 <w:rFonts w:ascii="Arial" w:hAnsi="Arial"/>
                 <w:b/>
                 <w:color w:val="FFFFFF"/>
-                <w:sz w:val="20"/>
+                <w:sz w:val="19"/>
               </w:rPr>
               <w:t>Category</w:t>
             </w:r>
@@ -1922,12 +2039,13 @@
         <w:tc>
           <w:tcPr>
             <w:tcW w:type="dxa" w:w="3312"/>
+            <w:tcW w:w="3311" w:type="dxa"/>
             <w:shd w:fill="00529B"/>
             <w:tcMar>
-              <w:top w:w="120" w:type="dxa"/>
-              <w:bottom w:w="120" w:type="dxa"/>
-              <w:left w:w="140" w:type="dxa"/>
-              <w:right w:w="140" w:type="dxa"/>
+              <w:top w:w="100" w:type="dxa"/>
+              <w:bottom w:w="100" w:type="dxa"/>
+              <w:left w:w="100" w:type="dxa"/>
+              <w:right w:w="100" w:type="dxa"/>
             </w:tcMar>
           </w:tcPr>
           <w:p>
@@ -1939,7 +2057,7 @@
                 <w:rFonts w:ascii="Arial" w:hAnsi="Arial"/>
                 <w:b/>
                 <w:color w:val="FFFFFF"/>
-                <w:sz w:val="20"/>
+                <w:sz w:val="19"/>
               </w:rPr>
               <w:t>Target Metric</w:t>
             </w:r>
@@ -1948,12 +2066,13 @@
         <w:tc>
           <w:tcPr>
             <w:tcW w:type="dxa" w:w="2592"/>
+            <w:tcW w:w="2592" w:type="dxa"/>
             <w:shd w:fill="00529B"/>
             <w:tcMar>
-              <w:top w:w="120" w:type="dxa"/>
-              <w:bottom w:w="120" w:type="dxa"/>
-              <w:left w:w="140" w:type="dxa"/>
-              <w:right w:w="140" w:type="dxa"/>
+              <w:top w:w="100" w:type="dxa"/>
+              <w:bottom w:w="100" w:type="dxa"/>
+              <w:left w:w="100" w:type="dxa"/>
+              <w:right w:w="100" w:type="dxa"/>
             </w:tcMar>
           </w:tcPr>
           <w:p>
@@ -1965,7 +2084,7 @@
                 <w:rFonts w:ascii="Arial" w:hAnsi="Arial"/>
                 <w:b/>
                 <w:color w:val="FFFFFF"/>
-                <w:sz w:val="20"/>
+                <w:sz w:val="19"/>
               </w:rPr>
               <w:t>Verification Method</w:t>
             </w:r>
@@ -1973,15 +2092,19 @@
         </w:tc>
       </w:tr>
       <w:tr>
+        <w:trPr>
+          <w:cantSplit/>
+        </w:trPr>
         <w:tc>
           <w:tcPr>
             <w:tcW w:type="dxa" w:w="1440"/>
+            <w:tcW w:w="1440" w:type="dxa"/>
             <w:shd w:fill="FFFFFF"/>
             <w:tcMar>
-              <w:top w:w="80" w:type="dxa"/>
-              <w:bottom w:w="80" w:type="dxa"/>
-              <w:left w:w="120" w:type="dxa"/>
-              <w:right w:w="120" w:type="dxa"/>
+              <w:top w:w="60" w:type="dxa"/>
+              <w:bottom w:w="60" w:type="dxa"/>
+              <w:left w:w="80" w:type="dxa"/>
+              <w:right w:w="80" w:type="dxa"/>
             </w:tcMar>
           </w:tcPr>
           <w:p>
@@ -1991,7 +2114,7 @@
             <w:r>
               <w:rPr>
                 <w:rFonts w:ascii="Times New Roman" w:hAnsi="Times New Roman"/>
-                <w:sz w:val="20"/>
+                <w:sz w:val="19"/>
               </w:rPr>
               <w:t>NFR-01</w:t>
             </w:r>
@@ -2000,12 +2123,13 @@
         <w:tc>
           <w:tcPr>
             <w:tcW w:type="dxa" w:w="2016"/>
+            <w:tcW w:w="2015" w:type="dxa"/>
             <w:shd w:fill="FFFFFF"/>
             <w:tcMar>
-              <w:top w:w="80" w:type="dxa"/>
-              <w:bottom w:w="80" w:type="dxa"/>
-              <w:left w:w="120" w:type="dxa"/>
-              <w:right w:w="120" w:type="dxa"/>
+              <w:top w:w="60" w:type="dxa"/>
+              <w:bottom w:w="60" w:type="dxa"/>
+              <w:left w:w="80" w:type="dxa"/>
+              <w:right w:w="80" w:type="dxa"/>
             </w:tcMar>
           </w:tcPr>
           <w:p>
@@ -2015,7 +2139,7 @@
             <w:r>
               <w:rPr>
                 <w:rFonts w:ascii="Times New Roman" w:hAnsi="Times New Roman"/>
-                <w:sz w:val="20"/>
+                <w:sz w:val="19"/>
               </w:rPr>
               <w:t>Inference Latency</w:t>
             </w:r>
@@ -2024,12 +2148,13 @@
         <w:tc>
           <w:tcPr>
             <w:tcW w:type="dxa" w:w="3312"/>
+            <w:tcW w:w="3311" w:type="dxa"/>
             <w:shd w:fill="FFFFFF"/>
             <w:tcMar>
-              <w:top w:w="80" w:type="dxa"/>
-              <w:bottom w:w="80" w:type="dxa"/>
-              <w:left w:w="120" w:type="dxa"/>
-              <w:right w:w="120" w:type="dxa"/>
+              <w:top w:w="60" w:type="dxa"/>
+              <w:bottom w:w="60" w:type="dxa"/>
+              <w:left w:w="80" w:type="dxa"/>
+              <w:right w:w="80" w:type="dxa"/>
             </w:tcMar>
           </w:tcPr>
           <w:p>
@@ -2039,7 +2164,7 @@
             <w:r>
               <w:rPr>
                 <w:rFonts w:ascii="Times New Roman" w:hAnsi="Times New Roman"/>
-                <w:sz w:val="20"/>
+                <w:sz w:val="19"/>
               </w:rPr>
               <w:t>&lt; 1.0 ms on edge hardware (Raspberry Pi 4B)</w:t>
             </w:r>
@@ -2048,12 +2173,13 @@
         <w:tc>
           <w:tcPr>
             <w:tcW w:type="dxa" w:w="2592"/>
+            <w:tcW w:w="2592" w:type="dxa"/>
             <w:shd w:fill="FFFFFF"/>
             <w:tcMar>
-              <w:top w:w="80" w:type="dxa"/>
-              <w:bottom w:w="80" w:type="dxa"/>
-              <w:left w:w="120" w:type="dxa"/>
-              <w:right w:w="120" w:type="dxa"/>
+              <w:top w:w="60" w:type="dxa"/>
+              <w:bottom w:w="60" w:type="dxa"/>
+              <w:left w:w="80" w:type="dxa"/>
+              <w:right w:w="80" w:type="dxa"/>
             </w:tcMar>
           </w:tcPr>
           <w:p>
@@ -2065,7 +2191,7 @@
                 <w:rFonts w:ascii="Times New Roman" w:hAnsi="Times New Roman"/>
                 <w:b/>
                 <w:color w:val="10B981"/>
-                <w:sz w:val="20"/>
+                <w:sz w:val="19"/>
               </w:rPr>
               <w:t>Benchmarked at 0.76 ms over 1,000 inference runs (PASS)</w:t>
             </w:r>
@@ -2073,15 +2199,19 @@
         </w:tc>
       </w:tr>
       <w:tr>
+        <w:trPr>
+          <w:cantSplit/>
+        </w:trPr>
         <w:tc>
           <w:tcPr>
             <w:tcW w:type="dxa" w:w="1440"/>
+            <w:tcW w:w="1440" w:type="dxa"/>
             <w:shd w:fill="F8FAFC"/>
             <w:tcMar>
-              <w:top w:w="80" w:type="dxa"/>
-              <w:bottom w:w="80" w:type="dxa"/>
-              <w:left w:w="120" w:type="dxa"/>
-              <w:right w:w="120" w:type="dxa"/>
+              <w:top w:w="60" w:type="dxa"/>
+              <w:bottom w:w="60" w:type="dxa"/>
+              <w:left w:w="80" w:type="dxa"/>
+              <w:right w:w="80" w:type="dxa"/>
             </w:tcMar>
           </w:tcPr>
           <w:p>
@@ -2091,7 +2221,7 @@
             <w:r>
               <w:rPr>
                 <w:rFonts w:ascii="Times New Roman" w:hAnsi="Times New Roman"/>
-                <w:sz w:val="20"/>
+                <w:sz w:val="19"/>
               </w:rPr>
               <w:t>NFR-02</w:t>
             </w:r>
@@ -2100,12 +2230,13 @@
         <w:tc>
           <w:tcPr>
             <w:tcW w:type="dxa" w:w="2016"/>
+            <w:tcW w:w="2015" w:type="dxa"/>
             <w:shd w:fill="F8FAFC"/>
             <w:tcMar>
-              <w:top w:w="80" w:type="dxa"/>
-              <w:bottom w:w="80" w:type="dxa"/>
-              <w:left w:w="120" w:type="dxa"/>
-              <w:right w:w="120" w:type="dxa"/>
+              <w:top w:w="60" w:type="dxa"/>
+              <w:bottom w:w="60" w:type="dxa"/>
+              <w:left w:w="80" w:type="dxa"/>
+              <w:right w:w="80" w:type="dxa"/>
             </w:tcMar>
           </w:tcPr>
           <w:p>
@@ -2115,7 +2246,7 @@
             <w:r>
               <w:rPr>
                 <w:rFonts w:ascii="Times New Roman" w:hAnsi="Times New Roman"/>
-                <w:sz w:val="20"/>
+                <w:sz w:val="19"/>
               </w:rPr>
               <w:t>Memory Footprint</w:t>
             </w:r>
@@ -2124,12 +2255,13 @@
         <w:tc>
           <w:tcPr>
             <w:tcW w:type="dxa" w:w="3312"/>
+            <w:tcW w:w="3311" w:type="dxa"/>
             <w:shd w:fill="F8FAFC"/>
             <w:tcMar>
-              <w:top w:w="80" w:type="dxa"/>
-              <w:bottom w:w="80" w:type="dxa"/>
-              <w:left w:w="120" w:type="dxa"/>
-              <w:right w:w="120" w:type="dxa"/>
+              <w:top w:w="60" w:type="dxa"/>
+              <w:bottom w:w="60" w:type="dxa"/>
+              <w:left w:w="80" w:type="dxa"/>
+              <w:right w:w="80" w:type="dxa"/>
             </w:tcMar>
           </w:tcPr>
           <w:p>
@@ -2139,7 +2271,7 @@
             <w:r>
               <w:rPr>
                 <w:rFonts w:ascii="Times New Roman" w:hAnsi="Times New Roman"/>
-                <w:sz w:val="20"/>
+                <w:sz w:val="19"/>
               </w:rPr>
               <w:t>&lt; 512 MB peak RAM on 1GB RAM edge gateway</w:t>
             </w:r>
@@ -2148,12 +2280,13 @@
         <w:tc>
           <w:tcPr>
             <w:tcW w:type="dxa" w:w="2592"/>
+            <w:tcW w:w="2592" w:type="dxa"/>
             <w:shd w:fill="F8FAFC"/>
             <w:tcMar>
-              <w:top w:w="80" w:type="dxa"/>
-              <w:bottom w:w="80" w:type="dxa"/>
-              <w:left w:w="120" w:type="dxa"/>
-              <w:right w:w="120" w:type="dxa"/>
+              <w:top w:w="60" w:type="dxa"/>
+              <w:bottom w:w="60" w:type="dxa"/>
+              <w:left w:w="80" w:type="dxa"/>
+              <w:right w:w="80" w:type="dxa"/>
             </w:tcMar>
           </w:tcPr>
           <w:p>
@@ -2165,7 +2298,7 @@
                 <w:rFonts w:ascii="Times New Roman" w:hAnsi="Times New Roman"/>
                 <w:b/>
                 <w:color w:val="10B981"/>
-                <w:sz w:val="20"/>
+                <w:sz w:val="19"/>
               </w:rPr>
               <w:t>Profiled at 290.31 MB peak memory consumption (PASS)</w:t>
             </w:r>
@@ -2173,15 +2306,19 @@
         </w:tc>
       </w:tr>
       <w:tr>
+        <w:trPr>
+          <w:cantSplit/>
+        </w:trPr>
         <w:tc>
           <w:tcPr>
             <w:tcW w:type="dxa" w:w="1440"/>
+            <w:tcW w:w="1440" w:type="dxa"/>
             <w:shd w:fill="FFFFFF"/>
             <w:tcMar>
-              <w:top w:w="80" w:type="dxa"/>
-              <w:bottom w:w="80" w:type="dxa"/>
-              <w:left w:w="120" w:type="dxa"/>
-              <w:right w:w="120" w:type="dxa"/>
+              <w:top w:w="60" w:type="dxa"/>
+              <w:bottom w:w="60" w:type="dxa"/>
+              <w:left w:w="80" w:type="dxa"/>
+              <w:right w:w="80" w:type="dxa"/>
             </w:tcMar>
           </w:tcPr>
           <w:p>
@@ -2191,7 +2328,7 @@
             <w:r>
               <w:rPr>
                 <w:rFonts w:ascii="Times New Roman" w:hAnsi="Times New Roman"/>
-                <w:sz w:val="20"/>
+                <w:sz w:val="19"/>
               </w:rPr>
               <w:t>NFR-03</w:t>
             </w:r>
@@ -2200,12 +2337,13 @@
         <w:tc>
           <w:tcPr>
             <w:tcW w:type="dxa" w:w="2016"/>
+            <w:tcW w:w="2015" w:type="dxa"/>
             <w:shd w:fill="FFFFFF"/>
             <w:tcMar>
-              <w:top w:w="80" w:type="dxa"/>
-              <w:bottom w:w="80" w:type="dxa"/>
-              <w:left w:w="120" w:type="dxa"/>
-              <w:right w:w="120" w:type="dxa"/>
+              <w:top w:w="60" w:type="dxa"/>
+              <w:bottom w:w="60" w:type="dxa"/>
+              <w:left w:w="80" w:type="dxa"/>
+              <w:right w:w="80" w:type="dxa"/>
             </w:tcMar>
           </w:tcPr>
           <w:p>
@@ -2215,7 +2353,7 @@
             <w:r>
               <w:rPr>
                 <w:rFonts w:ascii="Times New Roman" w:hAnsi="Times New Roman"/>
-                <w:sz w:val="20"/>
+                <w:sz w:val="19"/>
               </w:rPr>
               <w:t>Model Storage Size</w:t>
             </w:r>
@@ -2224,12 +2362,13 @@
         <w:tc>
           <w:tcPr>
             <w:tcW w:type="dxa" w:w="3312"/>
+            <w:tcW w:w="3311" w:type="dxa"/>
             <w:shd w:fill="FFFFFF"/>
             <w:tcMar>
-              <w:top w:w="80" w:type="dxa"/>
-              <w:bottom w:w="80" w:type="dxa"/>
-              <w:left w:w="120" w:type="dxa"/>
-              <w:right w:w="120" w:type="dxa"/>
+              <w:top w:w="60" w:type="dxa"/>
+              <w:bottom w:w="60" w:type="dxa"/>
+              <w:left w:w="80" w:type="dxa"/>
+              <w:right w:w="80" w:type="dxa"/>
             </w:tcMar>
           </w:tcPr>
           <w:p>
@@ -2239,7 +2378,7 @@
             <w:r>
               <w:rPr>
                 <w:rFonts w:ascii="Times New Roman" w:hAnsi="Times New Roman"/>
-                <w:sz w:val="20"/>
+                <w:sz w:val="19"/>
               </w:rPr>
               <w:t>&lt; 1.0 MB compressed TFLite binary</w:t>
             </w:r>
@@ -2248,12 +2387,13 @@
         <w:tc>
           <w:tcPr>
             <w:tcW w:type="dxa" w:w="2592"/>
+            <w:tcW w:w="2592" w:type="dxa"/>
             <w:shd w:fill="FFFFFF"/>
             <w:tcMar>
-              <w:top w:w="80" w:type="dxa"/>
-              <w:bottom w:w="80" w:type="dxa"/>
-              <w:left w:w="120" w:type="dxa"/>
-              <w:right w:w="120" w:type="dxa"/>
+              <w:top w:w="60" w:type="dxa"/>
+              <w:bottom w:w="60" w:type="dxa"/>
+              <w:left w:w="80" w:type="dxa"/>
+              <w:right w:w="80" w:type="dxa"/>
             </w:tcMar>
           </w:tcPr>
           <w:p>
@@ -2265,7 +2405,7 @@
                 <w:rFonts w:ascii="Times New Roman" w:hAnsi="Times New Roman"/>
                 <w:b/>
                 <w:color w:val="10B981"/>
-                <w:sz w:val="20"/>
+                <w:sz w:val="19"/>
               </w:rPr>
               <w:t>Measured at exactly 0.82 MB (83.2% compression ratio, PASS)</w:t>
             </w:r>
@@ -2273,15 +2413,19 @@
         </w:tc>
       </w:tr>
       <w:tr>
+        <w:trPr>
+          <w:cantSplit/>
+        </w:trPr>
         <w:tc>
           <w:tcPr>
             <w:tcW w:type="dxa" w:w="1440"/>
+            <w:tcW w:w="1440" w:type="dxa"/>
             <w:shd w:fill="F8FAFC"/>
             <w:tcMar>
-              <w:top w:w="80" w:type="dxa"/>
-              <w:bottom w:w="80" w:type="dxa"/>
-              <w:left w:w="120" w:type="dxa"/>
-              <w:right w:w="120" w:type="dxa"/>
+              <w:top w:w="60" w:type="dxa"/>
+              <w:bottom w:w="60" w:type="dxa"/>
+              <w:left w:w="80" w:type="dxa"/>
+              <w:right w:w="80" w:type="dxa"/>
             </w:tcMar>
           </w:tcPr>
           <w:p>
@@ -2291,7 +2435,7 @@
             <w:r>
               <w:rPr>
                 <w:rFonts w:ascii="Times New Roman" w:hAnsi="Times New Roman"/>
-                <w:sz w:val="20"/>
+                <w:sz w:val="19"/>
               </w:rPr>
               <w:t>NFR-04</w:t>
             </w:r>
@@ -2300,12 +2444,13 @@
         <w:tc>
           <w:tcPr>
             <w:tcW w:type="dxa" w:w="2016"/>
+            <w:tcW w:w="2015" w:type="dxa"/>
             <w:shd w:fill="F8FAFC"/>
             <w:tcMar>
-              <w:top w:w="80" w:type="dxa"/>
-              <w:bottom w:w="80" w:type="dxa"/>
-              <w:left w:w="120" w:type="dxa"/>
-              <w:right w:w="120" w:type="dxa"/>
+              <w:top w:w="60" w:type="dxa"/>
+              <w:bottom w:w="60" w:type="dxa"/>
+              <w:left w:w="80" w:type="dxa"/>
+              <w:right w:w="80" w:type="dxa"/>
             </w:tcMar>
           </w:tcPr>
           <w:p>
@@ -2315,7 +2460,7 @@
             <w:r>
               <w:rPr>
                 <w:rFonts w:ascii="Times New Roman" w:hAnsi="Times New Roman"/>
-                <w:sz w:val="20"/>
+                <w:sz w:val="19"/>
               </w:rPr>
               <w:t>Power Efficiency</w:t>
             </w:r>
@@ -2324,12 +2469,13 @@
         <w:tc>
           <w:tcPr>
             <w:tcW w:type="dxa" w:w="3312"/>
+            <w:tcW w:w="3311" w:type="dxa"/>
             <w:shd w:fill="F8FAFC"/>
             <w:tcMar>
-              <w:top w:w="80" w:type="dxa"/>
-              <w:bottom w:w="80" w:type="dxa"/>
-              <w:left w:w="120" w:type="dxa"/>
-              <w:right w:w="120" w:type="dxa"/>
+              <w:top w:w="60" w:type="dxa"/>
+              <w:bottom w:w="60" w:type="dxa"/>
+              <w:left w:w="80" w:type="dxa"/>
+              <w:right w:w="80" w:type="dxa"/>
             </w:tcMar>
           </w:tcPr>
           <w:p>
@@ -2339,7 +2485,7 @@
             <w:r>
               <w:rPr>
                 <w:rFonts w:ascii="Times New Roman" w:hAnsi="Times New Roman"/>
-                <w:sz w:val="20"/>
+                <w:sz w:val="19"/>
               </w:rPr>
               <w:t>&lt; 3.0 Watts continuous power draw</w:t>
             </w:r>
@@ -2348,12 +2494,13 @@
         <w:tc>
           <w:tcPr>
             <w:tcW w:type="dxa" w:w="2592"/>
+            <w:tcW w:w="2592" w:type="dxa"/>
             <w:shd w:fill="F8FAFC"/>
             <w:tcMar>
-              <w:top w:w="80" w:type="dxa"/>
-              <w:bottom w:w="80" w:type="dxa"/>
-              <w:left w:w="120" w:type="dxa"/>
-              <w:right w:w="120" w:type="dxa"/>
+              <w:top w:w="60" w:type="dxa"/>
+              <w:bottom w:w="60" w:type="dxa"/>
+              <w:left w:w="80" w:type="dxa"/>
+              <w:right w:w="80" w:type="dxa"/>
             </w:tcMar>
           </w:tcPr>
           <w:p>
@@ -2365,7 +2512,7 @@
                 <w:rFonts w:ascii="Times New Roman" w:hAnsi="Times New Roman"/>
                 <w:b/>
                 <w:color w:val="10B981"/>
-                <w:sz w:val="20"/>
+                <w:sz w:val="19"/>
               </w:rPr>
               <w:t>Measured at 2.5 Watts under continuous load, solar/battery ready (PASS)</w:t>
             </w:r>
@@ -2373,15 +2520,19 @@
         </w:tc>
       </w:tr>
       <w:tr>
+        <w:trPr>
+          <w:cantSplit/>
+        </w:trPr>
         <w:tc>
           <w:tcPr>
             <w:tcW w:type="dxa" w:w="1440"/>
+            <w:tcW w:w="1440" w:type="dxa"/>
             <w:shd w:fill="FFFFFF"/>
             <w:tcMar>
-              <w:top w:w="80" w:type="dxa"/>
-              <w:bottom w:w="80" w:type="dxa"/>
-              <w:left w:w="120" w:type="dxa"/>
-              <w:right w:w="120" w:type="dxa"/>
+              <w:top w:w="60" w:type="dxa"/>
+              <w:bottom w:w="60" w:type="dxa"/>
+              <w:left w:w="80" w:type="dxa"/>
+              <w:right w:w="80" w:type="dxa"/>
             </w:tcMar>
           </w:tcPr>
           <w:p>
@@ -2391,7 +2542,7 @@
             <w:r>
               <w:rPr>
                 <w:rFonts w:ascii="Times New Roman" w:hAnsi="Times New Roman"/>
-                <w:sz w:val="20"/>
+                <w:sz w:val="19"/>
               </w:rPr>
               <w:t>NFR-05</w:t>
             </w:r>
@@ -2400,12 +2551,13 @@
         <w:tc>
           <w:tcPr>
             <w:tcW w:type="dxa" w:w="2016"/>
+            <w:tcW w:w="2015" w:type="dxa"/>
             <w:shd w:fill="FFFFFF"/>
             <w:tcMar>
-              <w:top w:w="80" w:type="dxa"/>
-              <w:bottom w:w="80" w:type="dxa"/>
-              <w:left w:w="120" w:type="dxa"/>
-              <w:right w:w="120" w:type="dxa"/>
+              <w:top w:w="60" w:type="dxa"/>
+              <w:bottom w:w="60" w:type="dxa"/>
+              <w:left w:w="80" w:type="dxa"/>
+              <w:right w:w="80" w:type="dxa"/>
             </w:tcMar>
           </w:tcPr>
           <w:p>
@@ -2415,7 +2567,7 @@
             <w:r>
               <w:rPr>
                 <w:rFonts w:ascii="Times New Roman" w:hAnsi="Times New Roman"/>
-                <w:sz w:val="20"/>
+                <w:sz w:val="19"/>
               </w:rPr>
               <w:t>Classification Accuracy</w:t>
             </w:r>
@@ -2424,12 +2576,13 @@
         <w:tc>
           <w:tcPr>
             <w:tcW w:type="dxa" w:w="3312"/>
+            <w:tcW w:w="3311" w:type="dxa"/>
             <w:shd w:fill="FFFFFF"/>
             <w:tcMar>
-              <w:top w:w="80" w:type="dxa"/>
-              <w:bottom w:w="80" w:type="dxa"/>
-              <w:left w:w="120" w:type="dxa"/>
-              <w:right w:w="120" w:type="dxa"/>
+              <w:top w:w="60" w:type="dxa"/>
+              <w:bottom w:w="60" w:type="dxa"/>
+              <w:left w:w="80" w:type="dxa"/>
+              <w:right w:w="80" w:type="dxa"/>
             </w:tcMar>
           </w:tcPr>
           <w:p>
@@ -2439,7 +2592,7 @@
             <w:r>
               <w:rPr>
                 <w:rFonts w:ascii="Times New Roman" w:hAnsi="Times New Roman"/>
-                <w:sz w:val="20"/>
+                <w:sz w:val="19"/>
               </w:rPr>
               <w:t>&gt; 70.0% multi-class accuracy on KDDTest+</w:t>
             </w:r>
@@ -2448,12 +2601,13 @@
         <w:tc>
           <w:tcPr>
             <w:tcW w:type="dxa" w:w="2592"/>
+            <w:tcW w:w="2592" w:type="dxa"/>
             <w:shd w:fill="FFFFFF"/>
             <w:tcMar>
-              <w:top w:w="80" w:type="dxa"/>
-              <w:bottom w:w="80" w:type="dxa"/>
-              <w:left w:w="120" w:type="dxa"/>
-              <w:right w:w="120" w:type="dxa"/>
+              <w:top w:w="60" w:type="dxa"/>
+              <w:bottom w:w="60" w:type="dxa"/>
+              <w:left w:w="80" w:type="dxa"/>
+              <w:right w:w="80" w:type="dxa"/>
             </w:tcMar>
           </w:tcPr>
           <w:p>
@@ -2465,7 +2619,7 @@
                 <w:rFonts w:ascii="Times New Roman" w:hAnsi="Times New Roman"/>
                 <w:b/>
                 <w:color w:val="10B981"/>
-                <w:sz w:val="20"/>
+                <w:sz w:val="19"/>
               </w:rPr>
               <w:t>Achieved 70.56% accuracy and 0.7127 Macro F1 on 22,544 samples (PASS)</w:t>
             </w:r>
@@ -2473,15 +2627,19 @@
         </w:tc>
       </w:tr>
       <w:tr>
+        <w:trPr>
+          <w:cantSplit/>
+        </w:trPr>
         <w:tc>
           <w:tcPr>
             <w:tcW w:type="dxa" w:w="1440"/>
+            <w:tcW w:w="1440" w:type="dxa"/>
             <w:shd w:fill="F8FAFC"/>
             <w:tcMar>
-              <w:top w:w="80" w:type="dxa"/>
-              <w:bottom w:w="80" w:type="dxa"/>
-              <w:left w:w="120" w:type="dxa"/>
-              <w:right w:w="120" w:type="dxa"/>
+              <w:top w:w="60" w:type="dxa"/>
+              <w:bottom w:w="60" w:type="dxa"/>
+              <w:left w:w="80" w:type="dxa"/>
+              <w:right w:w="80" w:type="dxa"/>
             </w:tcMar>
           </w:tcPr>
           <w:p>
@@ -2491,7 +2649,7 @@
             <w:r>
               <w:rPr>
                 <w:rFonts w:ascii="Times New Roman" w:hAnsi="Times New Roman"/>
-                <w:sz w:val="20"/>
+                <w:sz w:val="19"/>
               </w:rPr>
               <w:t>NFR-06</w:t>
             </w:r>
@@ -2500,12 +2658,13 @@
         <w:tc>
           <w:tcPr>
             <w:tcW w:type="dxa" w:w="2016"/>
+            <w:tcW w:w="2015" w:type="dxa"/>
             <w:shd w:fill="F8FAFC"/>
             <w:tcMar>
-              <w:top w:w="80" w:type="dxa"/>
-              <w:bottom w:w="80" w:type="dxa"/>
-              <w:left w:w="120" w:type="dxa"/>
-              <w:right w:w="120" w:type="dxa"/>
+              <w:top w:w="60" w:type="dxa"/>
+              <w:bottom w:w="60" w:type="dxa"/>
+              <w:left w:w="80" w:type="dxa"/>
+              <w:right w:w="80" w:type="dxa"/>
             </w:tcMar>
           </w:tcPr>
           <w:p>
@@ -2515,7 +2674,7 @@
             <w:r>
               <w:rPr>
                 <w:rFonts w:ascii="Times New Roman" w:hAnsi="Times New Roman"/>
-                <w:sz w:val="20"/>
+                <w:sz w:val="19"/>
               </w:rPr>
               <w:t>Benign Precision</w:t>
             </w:r>
@@ -2524,12 +2683,13 @@
         <w:tc>
           <w:tcPr>
             <w:tcW w:type="dxa" w:w="3312"/>
+            <w:tcW w:w="3311" w:type="dxa"/>
             <w:shd w:fill="F8FAFC"/>
             <w:tcMar>
-              <w:top w:w="80" w:type="dxa"/>
-              <w:bottom w:w="80" w:type="dxa"/>
-              <w:left w:w="120" w:type="dxa"/>
-              <w:right w:w="120" w:type="dxa"/>
+              <w:top w:w="60" w:type="dxa"/>
+              <w:bottom w:w="60" w:type="dxa"/>
+              <w:left w:w="80" w:type="dxa"/>
+              <w:right w:w="80" w:type="dxa"/>
             </w:tcMar>
           </w:tcPr>
           <w:p>
@@ -2539,7 +2699,7 @@
             <w:r>
               <w:rPr>
                 <w:rFonts w:ascii="Times New Roman" w:hAnsi="Times New Roman"/>
-                <w:sz w:val="20"/>
+                <w:sz w:val="19"/>
               </w:rPr>
               <w:t>&gt; 95.0% precision on normal mining traffic</w:t>
             </w:r>
@@ -2548,12 +2708,13 @@
         <w:tc>
           <w:tcPr>
             <w:tcW w:type="dxa" w:w="2592"/>
+            <w:tcW w:w="2592" w:type="dxa"/>
             <w:shd w:fill="F8FAFC"/>
             <w:tcMar>
-              <w:top w:w="80" w:type="dxa"/>
-              <w:bottom w:w="80" w:type="dxa"/>
-              <w:left w:w="120" w:type="dxa"/>
-              <w:right w:w="120" w:type="dxa"/>
+              <w:top w:w="60" w:type="dxa"/>
+              <w:bottom w:w="60" w:type="dxa"/>
+              <w:left w:w="80" w:type="dxa"/>
+              <w:right w:w="80" w:type="dxa"/>
             </w:tcMar>
           </w:tcPr>
           <w:p>
@@ -2565,7 +2726,7 @@
                 <w:rFonts w:ascii="Times New Roman" w:hAnsi="Times New Roman"/>
                 <w:b/>
                 <w:color w:val="10B981"/>
-                <w:sz w:val="20"/>
+                <w:sz w:val="19"/>
               </w:rPr>
               <w:t>Achieved 96.89% precision, preventing false operational shutdowns (PASS)</w:t>
             </w:r>
@@ -2573,15 +2734,19 @@
         </w:tc>
       </w:tr>
       <w:tr>
+        <w:trPr>
+          <w:cantSplit/>
+        </w:trPr>
         <w:tc>
           <w:tcPr>
             <w:tcW w:type="dxa" w:w="1440"/>
+            <w:tcW w:w="1440" w:type="dxa"/>
             <w:shd w:fill="FFFFFF"/>
             <w:tcMar>
-              <w:top w:w="80" w:type="dxa"/>
-              <w:bottom w:w="80" w:type="dxa"/>
-              <w:left w:w="120" w:type="dxa"/>
-              <w:right w:w="120" w:type="dxa"/>
+              <w:top w:w="60" w:type="dxa"/>
+              <w:bottom w:w="60" w:type="dxa"/>
+              <w:left w:w="80" w:type="dxa"/>
+              <w:right w:w="80" w:type="dxa"/>
             </w:tcMar>
           </w:tcPr>
           <w:p>
@@ -2591,7 +2756,7 @@
             <w:r>
               <w:rPr>
                 <w:rFonts w:ascii="Times New Roman" w:hAnsi="Times New Roman"/>
-                <w:sz w:val="20"/>
+                <w:sz w:val="19"/>
               </w:rPr>
               <w:t>NFR-07</w:t>
             </w:r>
@@ -2600,12 +2765,13 @@
         <w:tc>
           <w:tcPr>
             <w:tcW w:type="dxa" w:w="2016"/>
+            <w:tcW w:w="2015" w:type="dxa"/>
             <w:shd w:fill="FFFFFF"/>
             <w:tcMar>
-              <w:top w:w="80" w:type="dxa"/>
-              <w:bottom w:w="80" w:type="dxa"/>
-              <w:left w:w="120" w:type="dxa"/>
-              <w:right w:w="120" w:type="dxa"/>
+              <w:top w:w="60" w:type="dxa"/>
+              <w:bottom w:w="60" w:type="dxa"/>
+              <w:left w:w="80" w:type="dxa"/>
+              <w:right w:w="80" w:type="dxa"/>
             </w:tcMar>
           </w:tcPr>
           <w:p>
@@ -2615,7 +2781,7 @@
             <w:r>
               <w:rPr>
                 <w:rFonts w:ascii="Times New Roman" w:hAnsi="Times New Roman"/>
-                <w:sz w:val="20"/>
+                <w:sz w:val="19"/>
               </w:rPr>
               <w:t>DoS Attack Recall</w:t>
             </w:r>
@@ -2624,12 +2790,13 @@
         <w:tc>
           <w:tcPr>
             <w:tcW w:type="dxa" w:w="3312"/>
+            <w:tcW w:w="3311" w:type="dxa"/>
             <w:shd w:fill="FFFFFF"/>
             <w:tcMar>
-              <w:top w:w="80" w:type="dxa"/>
-              <w:bottom w:w="80" w:type="dxa"/>
-              <w:left w:w="120" w:type="dxa"/>
-              <w:right w:w="120" w:type="dxa"/>
+              <w:top w:w="60" w:type="dxa"/>
+              <w:bottom w:w="60" w:type="dxa"/>
+              <w:left w:w="80" w:type="dxa"/>
+              <w:right w:w="80" w:type="dxa"/>
             </w:tcMar>
           </w:tcPr>
           <w:p>
@@ -2639,7 +2806,7 @@
             <w:r>
               <w:rPr>
                 <w:rFonts w:ascii="Times New Roman" w:hAnsi="Times New Roman"/>
-                <w:sz w:val="20"/>
+                <w:sz w:val="19"/>
               </w:rPr>
               <w:t>&gt; 85.0% recall on volumetric attack streams</w:t>
             </w:r>
@@ -2648,12 +2815,13 @@
         <w:tc>
           <w:tcPr>
             <w:tcW w:type="dxa" w:w="2592"/>
+            <w:tcW w:w="2592" w:type="dxa"/>
             <w:shd w:fill="FFFFFF"/>
             <w:tcMar>
-              <w:top w:w="80" w:type="dxa"/>
-              <w:bottom w:w="80" w:type="dxa"/>
-              <w:left w:w="120" w:type="dxa"/>
-              <w:right w:w="120" w:type="dxa"/>
+              <w:top w:w="60" w:type="dxa"/>
+              <w:bottom w:w="60" w:type="dxa"/>
+              <w:left w:w="80" w:type="dxa"/>
+              <w:right w:w="80" w:type="dxa"/>
             </w:tcMar>
           </w:tcPr>
           <w:p>
@@ -2665,7 +2833,7 @@
                 <w:rFonts w:ascii="Times New Roman" w:hAnsi="Times New Roman"/>
                 <w:b/>
                 <w:color w:val="10B981"/>
-                <w:sz w:val="20"/>
+                <w:sz w:val="19"/>
               </w:rPr>
               <w:t>Achieved 89.04% recall on DoS intrusions (PASS)</w:t>
             </w:r>
@@ -2681,7 +2849,7 @@
     <w:p>
       <w:pPr>
         <w:keepNext/>
-        <w:spacing w:before="320" w:after="120"/>
+        <w:spacing w:before="360" w:after="120"/>
       </w:pPr>
       <w:r>
         <w:rPr>
@@ -2715,15 +2883,20 @@
         <w:gridCol w:w="2340"/>
       </w:tblGrid>
       <w:tr>
+        <w:trPr>
+          <w:cantSplit/>
+          <w:tblHeader/>
+        </w:trPr>
         <w:tc>
           <w:tcPr>
             <w:tcW w:type="dxa" w:w="1440"/>
+            <w:tcW w:w="1440" w:type="dxa"/>
             <w:shd w:fill="00529B"/>
             <w:tcMar>
-              <w:top w:w="120" w:type="dxa"/>
-              <w:bottom w:w="120" w:type="dxa"/>
-              <w:left w:w="140" w:type="dxa"/>
-              <w:right w:w="140" w:type="dxa"/>
+              <w:top w:w="100" w:type="dxa"/>
+              <w:bottom w:w="100" w:type="dxa"/>
+              <w:left w:w="100" w:type="dxa"/>
+              <w:right w:w="100" w:type="dxa"/>
             </w:tcMar>
           </w:tcPr>
           <w:p>
@@ -2735,7 +2908,7 @@
                 <w:rFonts w:ascii="Arial" w:hAnsi="Arial"/>
                 <w:b/>
                 <w:color w:val="FFFFFF"/>
-                <w:sz w:val="20"/>
+                <w:sz w:val="19"/>
               </w:rPr>
               <w:t>Phase</w:t>
             </w:r>
@@ -2744,12 +2917,13 @@
         <w:tc>
           <w:tcPr>
             <w:tcW w:type="dxa" w:w="2592"/>
+            <w:tcW w:w="2592" w:type="dxa"/>
             <w:shd w:fill="00529B"/>
             <w:tcMar>
-              <w:top w:w="120" w:type="dxa"/>
-              <w:bottom w:w="120" w:type="dxa"/>
-              <w:left w:w="140" w:type="dxa"/>
-              <w:right w:w="140" w:type="dxa"/>
+              <w:top w:w="100" w:type="dxa"/>
+              <w:bottom w:w="100" w:type="dxa"/>
+              <w:left w:w="100" w:type="dxa"/>
+              <w:right w:w="100" w:type="dxa"/>
             </w:tcMar>
           </w:tcPr>
           <w:p>
@@ -2761,7 +2935,7 @@
                 <w:rFonts w:ascii="Arial" w:hAnsi="Arial"/>
                 <w:b/>
                 <w:color w:val="FFFFFF"/>
-                <w:sz w:val="20"/>
+                <w:sz w:val="19"/>
               </w:rPr>
               <w:t>Milestone Name</w:t>
             </w:r>
@@ -2770,12 +2944,13 @@
         <w:tc>
           <w:tcPr>
             <w:tcW w:type="dxa" w:w="1728"/>
+            <w:tcW w:w="1728" w:type="dxa"/>
             <w:shd w:fill="00529B"/>
             <w:tcMar>
-              <w:top w:w="120" w:type="dxa"/>
-              <w:bottom w:w="120" w:type="dxa"/>
-              <w:left w:w="140" w:type="dxa"/>
-              <w:right w:w="140" w:type="dxa"/>
+              <w:top w:w="100" w:type="dxa"/>
+              <w:bottom w:w="100" w:type="dxa"/>
+              <w:left w:w="100" w:type="dxa"/>
+              <w:right w:w="100" w:type="dxa"/>
             </w:tcMar>
           </w:tcPr>
           <w:p>
@@ -2787,7 +2962,7 @@
                 <w:rFonts w:ascii="Arial" w:hAnsi="Arial"/>
                 <w:b/>
                 <w:color w:val="FFFFFF"/>
-                <w:sz w:val="20"/>
+                <w:sz w:val="19"/>
               </w:rPr>
               <w:t>Timeline</w:t>
             </w:r>
@@ -2796,12 +2971,13 @@
         <w:tc>
           <w:tcPr>
             <w:tcW w:type="dxa" w:w="3600"/>
+            <w:tcW w:w="3600" w:type="dxa"/>
             <w:shd w:fill="00529B"/>
             <w:tcMar>
-              <w:top w:w="120" w:type="dxa"/>
-              <w:bottom w:w="120" w:type="dxa"/>
-              <w:left w:w="140" w:type="dxa"/>
-              <w:right w:w="140" w:type="dxa"/>
+              <w:top w:w="100" w:type="dxa"/>
+              <w:bottom w:w="100" w:type="dxa"/>
+              <w:left w:w="100" w:type="dxa"/>
+              <w:right w:w="100" w:type="dxa"/>
             </w:tcMar>
           </w:tcPr>
           <w:p>
@@ -2813,7 +2989,7 @@
                 <w:rFonts w:ascii="Arial" w:hAnsi="Arial"/>
                 <w:b/>
                 <w:color w:val="FFFFFF"/>
-                <w:sz w:val="20"/>
+                <w:sz w:val="19"/>
               </w:rPr>
               <w:t>Core Deliverables &amp; KPIs</w:t>
             </w:r>
@@ -2821,15 +2997,19 @@
         </w:tc>
       </w:tr>
       <w:tr>
+        <w:trPr>
+          <w:cantSplit/>
+        </w:trPr>
         <w:tc>
           <w:tcPr>
             <w:tcW w:type="dxa" w:w="1440"/>
+            <w:tcW w:w="1440" w:type="dxa"/>
             <w:shd w:fill="FFFFFF"/>
             <w:tcMar>
-              <w:top w:w="80" w:type="dxa"/>
-              <w:bottom w:w="80" w:type="dxa"/>
-              <w:left w:w="120" w:type="dxa"/>
-              <w:right w:w="120" w:type="dxa"/>
+              <w:top w:w="60" w:type="dxa"/>
+              <w:bottom w:w="60" w:type="dxa"/>
+              <w:left w:w="80" w:type="dxa"/>
+              <w:right w:w="80" w:type="dxa"/>
             </w:tcMar>
           </w:tcPr>
           <w:p>
@@ -2839,7 +3019,7 @@
             <w:r>
               <w:rPr>
                 <w:rFonts w:ascii="Times New Roman" w:hAnsi="Times New Roman"/>
-                <w:sz w:val="20"/>
+                <w:sz w:val="19"/>
               </w:rPr>
               <w:t>Phase 1</w:t>
             </w:r>
@@ -2848,12 +3028,13 @@
         <w:tc>
           <w:tcPr>
             <w:tcW w:type="dxa" w:w="2592"/>
+            <w:tcW w:w="2592" w:type="dxa"/>
             <w:shd w:fill="FFFFFF"/>
             <w:tcMar>
-              <w:top w:w="80" w:type="dxa"/>
-              <w:bottom w:w="80" w:type="dxa"/>
-              <w:left w:w="120" w:type="dxa"/>
-              <w:right w:w="120" w:type="dxa"/>
+              <w:top w:w="60" w:type="dxa"/>
+              <w:bottom w:w="60" w:type="dxa"/>
+              <w:left w:w="80" w:type="dxa"/>
+              <w:right w:w="80" w:type="dxa"/>
             </w:tcMar>
           </w:tcPr>
           <w:p>
@@ -2863,7 +3044,7 @@
             <w:r>
               <w:rPr>
                 <w:rFonts w:ascii="Times New Roman" w:hAnsi="Times New Roman"/>
-                <w:sz w:val="20"/>
+                <w:sz w:val="19"/>
               </w:rPr>
               <w:t>Algorithm Design &amp; Benchmark Validation</w:t>
             </w:r>
@@ -2872,12 +3053,13 @@
         <w:tc>
           <w:tcPr>
             <w:tcW w:type="dxa" w:w="1728"/>
+            <w:tcW w:w="1728" w:type="dxa"/>
             <w:shd w:fill="FFFFFF"/>
             <w:tcMar>
-              <w:top w:w="80" w:type="dxa"/>
-              <w:bottom w:w="80" w:type="dxa"/>
-              <w:left w:w="120" w:type="dxa"/>
-              <w:right w:w="120" w:type="dxa"/>
+              <w:top w:w="60" w:type="dxa"/>
+              <w:bottom w:w="60" w:type="dxa"/>
+              <w:left w:w="80" w:type="dxa"/>
+              <w:right w:w="80" w:type="dxa"/>
             </w:tcMar>
           </w:tcPr>
           <w:p>
@@ -2887,7 +3069,7 @@
             <w:r>
               <w:rPr>
                 <w:rFonts w:ascii="Times New Roman" w:hAnsi="Times New Roman"/>
-                <w:sz w:val="20"/>
+                <w:sz w:val="19"/>
               </w:rPr>
               <w:t>Months 1 - 3</w:t>
             </w:r>
@@ -2896,12 +3078,13 @@
         <w:tc>
           <w:tcPr>
             <w:tcW w:type="dxa" w:w="3600"/>
+            <w:tcW w:w="3600" w:type="dxa"/>
             <w:shd w:fill="FFFFFF"/>
             <w:tcMar>
-              <w:top w:w="80" w:type="dxa"/>
-              <w:bottom w:w="80" w:type="dxa"/>
-              <w:left w:w="120" w:type="dxa"/>
-              <w:right w:w="120" w:type="dxa"/>
+              <w:top w:w="60" w:type="dxa"/>
+              <w:bottom w:w="60" w:type="dxa"/>
+              <w:left w:w="80" w:type="dxa"/>
+              <w:right w:w="80" w:type="dxa"/>
             </w:tcMar>
           </w:tcPr>
           <w:p>
@@ -2911,7 +3094,7 @@
             <w:r>
               <w:rPr>
                 <w:rFonts w:ascii="Times New Roman" w:hAnsi="Times New Roman"/>
-                <w:sz w:val="20"/>
+                <w:sz w:val="19"/>
               </w:rPr>
               <w:t>BWOA optimization, CNN-LSTM training, 75 unit test suite, Float16 quantization. Target: &gt;70% accuracy, &lt;1ms latency (COMPLETED).</w:t>
             </w:r>
@@ -2919,15 +3102,19 @@
         </w:tc>
       </w:tr>
       <w:tr>
+        <w:trPr>
+          <w:cantSplit/>
+        </w:trPr>
         <w:tc>
           <w:tcPr>
             <w:tcW w:type="dxa" w:w="1440"/>
+            <w:tcW w:w="1440" w:type="dxa"/>
             <w:shd w:fill="F8FAFC"/>
             <w:tcMar>
-              <w:top w:w="80" w:type="dxa"/>
-              <w:bottom w:w="80" w:type="dxa"/>
-              <w:left w:w="120" w:type="dxa"/>
-              <w:right w:w="120" w:type="dxa"/>
+              <w:top w:w="60" w:type="dxa"/>
+              <w:bottom w:w="60" w:type="dxa"/>
+              <w:left w:w="80" w:type="dxa"/>
+              <w:right w:w="80" w:type="dxa"/>
             </w:tcMar>
           </w:tcPr>
           <w:p>
@@ -2937,7 +3124,7 @@
             <w:r>
               <w:rPr>
                 <w:rFonts w:ascii="Times New Roman" w:hAnsi="Times New Roman"/>
-                <w:sz w:val="20"/>
+                <w:sz w:val="19"/>
               </w:rPr>
               <w:t>Phase 2</w:t>
             </w:r>
@@ -2946,12 +3133,13 @@
         <w:tc>
           <w:tcPr>
             <w:tcW w:type="dxa" w:w="2592"/>
+            <w:tcW w:w="2592" w:type="dxa"/>
             <w:shd w:fill="F8FAFC"/>
             <w:tcMar>
-              <w:top w:w="80" w:type="dxa"/>
-              <w:bottom w:w="80" w:type="dxa"/>
-              <w:left w:w="120" w:type="dxa"/>
-              <w:right w:w="120" w:type="dxa"/>
+              <w:top w:w="60" w:type="dxa"/>
+              <w:bottom w:w="60" w:type="dxa"/>
+              <w:left w:w="80" w:type="dxa"/>
+              <w:right w:w="80" w:type="dxa"/>
             </w:tcMar>
           </w:tcPr>
           <w:p>
@@ -2961,7 +3149,7 @@
             <w:r>
               <w:rPr>
                 <w:rFonts w:ascii="Times New Roman" w:hAnsi="Times New Roman"/>
-                <w:sz w:val="20"/>
+                <w:sz w:val="19"/>
               </w:rPr>
               <w:t>Edge Packaging &amp; Pilot Benchmarking</w:t>
             </w:r>
@@ -2970,12 +3158,13 @@
         <w:tc>
           <w:tcPr>
             <w:tcW w:type="dxa" w:w="1728"/>
+            <w:tcW w:w="1728" w:type="dxa"/>
             <w:shd w:fill="F8FAFC"/>
             <w:tcMar>
-              <w:top w:w="80" w:type="dxa"/>
-              <w:bottom w:w="80" w:type="dxa"/>
-              <w:left w:w="120" w:type="dxa"/>
-              <w:right w:w="120" w:type="dxa"/>
+              <w:top w:w="60" w:type="dxa"/>
+              <w:bottom w:w="60" w:type="dxa"/>
+              <w:left w:w="80" w:type="dxa"/>
+              <w:right w:w="80" w:type="dxa"/>
             </w:tcMar>
           </w:tcPr>
           <w:p>
@@ -2985,7 +3174,7 @@
             <w:r>
               <w:rPr>
                 <w:rFonts w:ascii="Times New Roman" w:hAnsi="Times New Roman"/>
-                <w:sz w:val="20"/>
+                <w:sz w:val="19"/>
               </w:rPr>
               <w:t>Months 4 - 6</w:t>
             </w:r>
@@ -2994,12 +3183,13 @@
         <w:tc>
           <w:tcPr>
             <w:tcW w:type="dxa" w:w="3600"/>
+            <w:tcW w:w="3600" w:type="dxa"/>
             <w:shd w:fill="F8FAFC"/>
             <w:tcMar>
-              <w:top w:w="80" w:type="dxa"/>
-              <w:bottom w:w="80" w:type="dxa"/>
-              <w:left w:w="120" w:type="dxa"/>
-              <w:right w:w="120" w:type="dxa"/>
+              <w:top w:w="60" w:type="dxa"/>
+              <w:bottom w:w="60" w:type="dxa"/>
+              <w:left w:w="80" w:type="dxa"/>
+              <w:right w:w="80" w:type="dxa"/>
             </w:tcMar>
           </w:tcPr>
           <w:p>
@@ -3009,7 +3199,7 @@
             <w:r>
               <w:rPr>
                 <w:rFonts w:ascii="Times New Roman" w:hAnsi="Times New Roman"/>
-                <w:sz w:val="20"/>
+                <w:sz w:val="19"/>
               </w:rPr>
               <w:t>NPM package (@mhiskall282/unesco-mine-sec-cli), SWaT transfer learning, Raspberry Pi deploy scripts, UNESCO Forum presentation.</w:t>
             </w:r>
@@ -3017,15 +3207,19 @@
         </w:tc>
       </w:tr>
       <w:tr>
+        <w:trPr>
+          <w:cantSplit/>
+        </w:trPr>
         <w:tc>
           <w:tcPr>
             <w:tcW w:type="dxa" w:w="1440"/>
+            <w:tcW w:w="1440" w:type="dxa"/>
             <w:shd w:fill="FFFFFF"/>
             <w:tcMar>
-              <w:top w:w="80" w:type="dxa"/>
-              <w:bottom w:w="80" w:type="dxa"/>
-              <w:left w:w="120" w:type="dxa"/>
-              <w:right w:w="120" w:type="dxa"/>
+              <w:top w:w="60" w:type="dxa"/>
+              <w:bottom w:w="60" w:type="dxa"/>
+              <w:left w:w="80" w:type="dxa"/>
+              <w:right w:w="80" w:type="dxa"/>
             </w:tcMar>
           </w:tcPr>
           <w:p>
@@ -3035,7 +3229,7 @@
             <w:r>
               <w:rPr>
                 <w:rFonts w:ascii="Times New Roman" w:hAnsi="Times New Roman"/>
-                <w:sz w:val="20"/>
+                <w:sz w:val="19"/>
               </w:rPr>
               <w:t>Phase 3</w:t>
             </w:r>
@@ -3044,12 +3238,13 @@
         <w:tc>
           <w:tcPr>
             <w:tcW w:type="dxa" w:w="2592"/>
+            <w:tcW w:w="2592" w:type="dxa"/>
             <w:shd w:fill="FFFFFF"/>
             <w:tcMar>
-              <w:top w:w="80" w:type="dxa"/>
-              <w:bottom w:w="80" w:type="dxa"/>
-              <w:left w:w="120" w:type="dxa"/>
-              <w:right w:w="120" w:type="dxa"/>
+              <w:top w:w="60" w:type="dxa"/>
+              <w:bottom w:w="60" w:type="dxa"/>
+              <w:left w:w="80" w:type="dxa"/>
+              <w:right w:w="80" w:type="dxa"/>
             </w:tcMar>
           </w:tcPr>
           <w:p>
@@ -3059,7 +3254,7 @@
             <w:r>
               <w:rPr>
                 <w:rFonts w:ascii="Times New Roman" w:hAnsi="Times New Roman"/>
-                <w:sz w:val="20"/>
+                <w:sz w:val="19"/>
               </w:rPr>
               <w:t>On-Site Field Validation &amp; Multi-Mine Rollout</w:t>
             </w:r>
@@ -3068,12 +3263,13 @@
         <w:tc>
           <w:tcPr>
             <w:tcW w:type="dxa" w:w="1728"/>
+            <w:tcW w:w="1728" w:type="dxa"/>
             <w:shd w:fill="FFFFFF"/>
             <w:tcMar>
-              <w:top w:w="80" w:type="dxa"/>
-              <w:bottom w:w="80" w:type="dxa"/>
-              <w:left w:w="120" w:type="dxa"/>
-              <w:right w:w="120" w:type="dxa"/>
+              <w:top w:w="60" w:type="dxa"/>
+              <w:bottom w:w="60" w:type="dxa"/>
+              <w:left w:w="80" w:type="dxa"/>
+              <w:right w:w="80" w:type="dxa"/>
             </w:tcMar>
           </w:tcPr>
           <w:p>
@@ -3083,7 +3279,7 @@
             <w:r>
               <w:rPr>
                 <w:rFonts w:ascii="Times New Roman" w:hAnsi="Times New Roman"/>
-                <w:sz w:val="20"/>
+                <w:sz w:val="19"/>
               </w:rPr>
               <w:t>Months 7 - 12</w:t>
             </w:r>
@@ -3092,12 +3288,13 @@
         <w:tc>
           <w:tcPr>
             <w:tcW w:type="dxa" w:w="3600"/>
+            <w:tcW w:w="3600" w:type="dxa"/>
             <w:shd w:fill="FFFFFF"/>
             <w:tcMar>
-              <w:top w:w="80" w:type="dxa"/>
-              <w:bottom w:w="80" w:type="dxa"/>
-              <w:left w:w="120" w:type="dxa"/>
-              <w:right w:w="120" w:type="dxa"/>
+              <w:top w:w="60" w:type="dxa"/>
+              <w:bottom w:w="60" w:type="dxa"/>
+              <w:left w:w="80" w:type="dxa"/>
+              <w:right w:w="80" w:type="dxa"/>
             </w:tcMar>
           </w:tcPr>
           <w:p>
@@ -3107,7 +3304,7 @@
             <w:r>
               <w:rPr>
                 <w:rFonts w:ascii="Times New Roman" w:hAnsi="Times New Roman"/>
-                <w:sz w:val="20"/>
+                <w:sz w:val="19"/>
               </w:rPr>
               <w:t>Live SCADA capture at Gold Fields Tarkwa, federated multi-concession learning, automated Minerals Commission ESG audit reporting.</w:t>
             </w:r>

</xml_diff>

<commit_message>
docs: replace Kayaba Labs with UEW Innovation Hub across all documentation, generators, and research papers
</commit_message>
<xml_diff>
--- a/research/PRD.docx
+++ b/research/PRD.docx
@@ -60,7 +60,7 @@
           <w:color w:val="64748B"/>
           <w:sz w:val="19"/>
         </w:rPr>
-        <w:t>University of Education, Winneba &amp; Kayaba Labs | Version 3.0.0 | Status: Approved for Deployment</w:t>
+        <w:t>University of Education, Winneba &amp; UEW Innovation Hub | Version 3.0.0 | Status: Approved for Deployment</w:t>
       </w:r>
     </w:p>
     <w:tbl>
@@ -501,7 +501,7 @@
                 <w:rFonts w:ascii="Times New Roman" w:hAnsi="Times New Roman"/>
                 <w:sz w:val="19"/>
               </w:rPr>
-              <w:t>University of Education, Winneba (UEW) &amp; Kayaba Labs</w:t>
+              <w:t>University of Education, Winneba (UEW) &amp; UEW Innovation Hub</w:t>
             </w:r>
           </w:p>
         </w:tc>

</xml_diff>

<commit_message>
docs(research): update all academic research papers, PRD, SRS, technical reports, and documentation with empirical cloud benchmarks
</commit_message>
<xml_diff>
--- a/research/PRD.docx
+++ b/research/PRD.docx
@@ -2840,6 +2840,113 @@
           </w:p>
         </w:tc>
       </w:tr>
+      <w:tr>
+        <w:trPr>
+          <w:cantSplit/>
+        </w:trPr>
+        <w:tc>
+          <w:tcPr>
+            <w:tcW w:type="dxa" w:w="1440"/>
+            <w:tcW w:w="1440" w:type="dxa"/>
+            <w:shd w:fill="F8FAFC"/>
+            <w:tcMar>
+              <w:top w:w="60" w:type="dxa"/>
+              <w:bottom w:w="60" w:type="dxa"/>
+              <w:left w:w="80" w:type="dxa"/>
+              <w:right w:w="80" w:type="dxa"/>
+            </w:tcMar>
+          </w:tcPr>
+          <w:p>
+            <w:pPr>
+              <w:jc w:val="left"/>
+            </w:pPr>
+            <w:r>
+              <w:rPr>
+                <w:rFonts w:ascii="Times New Roman" w:hAnsi="Times New Roman"/>
+                <w:sz w:val="19"/>
+              </w:rPr>
+              <w:t>NFR-08</w:t>
+            </w:r>
+          </w:p>
+        </w:tc>
+        <w:tc>
+          <w:tcPr>
+            <w:tcW w:type="dxa" w:w="2016"/>
+            <w:tcW w:w="2015" w:type="dxa"/>
+            <w:shd w:fill="F8FAFC"/>
+            <w:tcMar>
+              <w:top w:w="60" w:type="dxa"/>
+              <w:bottom w:w="60" w:type="dxa"/>
+              <w:left w:w="80" w:type="dxa"/>
+              <w:right w:w="80" w:type="dxa"/>
+            </w:tcMar>
+          </w:tcPr>
+          <w:p>
+            <w:pPr>
+              <w:jc w:val="center"/>
+            </w:pPr>
+            <w:r>
+              <w:rPr>
+                <w:rFonts w:ascii="Times New Roman" w:hAnsi="Times New Roman"/>
+                <w:sz w:val="19"/>
+              </w:rPr>
+              <w:t>Cloud Scalability &amp; Throughput</w:t>
+            </w:r>
+          </w:p>
+        </w:tc>
+        <w:tc>
+          <w:tcPr>
+            <w:tcW w:type="dxa" w:w="3312"/>
+            <w:tcW w:w="3311" w:type="dxa"/>
+            <w:shd w:fill="F8FAFC"/>
+            <w:tcMar>
+              <w:top w:w="60" w:type="dxa"/>
+              <w:bottom w:w="60" w:type="dxa"/>
+              <w:left w:w="80" w:type="dxa"/>
+              <w:right w:w="80" w:type="dxa"/>
+            </w:tcMar>
+          </w:tcPr>
+          <w:p>
+            <w:pPr>
+              <w:jc w:val="center"/>
+            </w:pPr>
+            <w:r>
+              <w:rPr>
+                <w:rFonts w:ascii="Times New Roman" w:hAnsi="Times New Roman"/>
+                <w:sz w:val="19"/>
+              </w:rPr>
+              <w:t>&gt; 500 req/s throughput on AWS EC2</w:t>
+            </w:r>
+          </w:p>
+        </w:tc>
+        <w:tc>
+          <w:tcPr>
+            <w:tcW w:type="dxa" w:w="2592"/>
+            <w:tcW w:w="2592" w:type="dxa"/>
+            <w:shd w:fill="F8FAFC"/>
+            <w:tcMar>
+              <w:top w:w="60" w:type="dxa"/>
+              <w:bottom w:w="60" w:type="dxa"/>
+              <w:left w:w="80" w:type="dxa"/>
+              <w:right w:w="80" w:type="dxa"/>
+            </w:tcMar>
+          </w:tcPr>
+          <w:p>
+            <w:pPr>
+              <w:jc w:val="center"/>
+            </w:pPr>
+            <w:r>
+              <w:rPr>
+                <w:rFonts w:ascii="Times New Roman" w:hAnsi="Times New Roman"/>
+                <w:b/>
+                <w:color w:val="10B981"/>
+                <w:sz w:val="19"/>
+              </w:rPr>
+              <w:t>Benchmarked at 617.13 req/s, 1.57 ms mean latency on AWS EC2 (PASS)</w:t>
+            </w:r>
+          </w:p>
+        </w:tc>
+      </w:tr>
     </w:tbl>
     <w:p>
       <w:pPr>
@@ -3151,7 +3258,7 @@
                 <w:rFonts w:ascii="Times New Roman" w:hAnsi="Times New Roman"/>
                 <w:sz w:val="19"/>
               </w:rPr>
-              <w:t>Edge Packaging &amp; Pilot Benchmarking</w:t>
+              <w:t>Edge &amp; Cloud Deployment &amp; Empirical Benchmarking</w:t>
             </w:r>
           </w:p>
         </w:tc>
@@ -3201,7 +3308,7 @@
                 <w:rFonts w:ascii="Times New Roman" w:hAnsi="Times New Roman"/>
                 <w:sz w:val="19"/>
               </w:rPr>
-              <w:t>NPM package (@mhiskall282/unesco-mine-sec-cli), SWaT transfer learning, Raspberry Pi deploy scripts, UNESCO Forum presentation.</w:t>
+              <w:t>NPM package (@mhiskall282/unesco-mine-sec-cli), SWaT transfer learning, Raspberry Pi &amp; AWS EC2 1-command deployers, live cloud empirical benchmarking (617 req/s, 1.57ms latency) and publication data export (COMPLETED).</w:t>
             </w:r>
           </w:p>
         </w:tc>

</xml_diff>